<commit_message>
Refine podcast 1: smoother Hebrew flow + opening agenda
- Rewrite opening so listener knows what's coming (3 host-volleys describing the day's agenda)
- Fix character cross-reference error (line 39: יצחק was addressing himself)
- Smooth choppy sentences throughout (e.g. 'אני, ב"ה, פותחים' was ungrammatical)
- Tighten transitions between segments

https://claude.ai/code/session_01STJfQRN2GEUeP9FJ22a6o5
</commit_message>
<xml_diff>
--- a/output/podcast-01-takhilato-shel-masa.docx
+++ b/output/podcast-01-takhilato-shel-masa.docx
@@ -82,7 +82,7 @@
           <w:b w:val="0"/>
           <w:sz w:val="22"/>
         </w:rPr>
-        <w:t>כמות מילים: כ-1,210</w:t>
+        <w:t>כמות מילים: כ-1,225</w:t>
       </w:r>
     </w:p>
     <w:p>
@@ -344,7 +344,7 @@
                 <w:b w:val="0"/>
                 <w:sz w:val="22"/>
               </w:rPr>
-              <w:t>שלום מאזינים יקרים, ברוכים הבאים. אני חיים, וכאן איתי כל הקורס יחד...</w:t>
+              <w:t>שלום מאזינים יקרים, ברוכים הבאים. אני חיים, וביחד איתי נמצא כאן...</w:t>
             </w:r>
           </w:p>
         </w:tc>
@@ -425,7 +425,7 @@
                 <w:b w:val="0"/>
                 <w:sz w:val="22"/>
               </w:rPr>
-              <w:t>יצחק. שלום שלום לכולם.</w:t>
+              <w:t>יצחק. שלום, שלום לכולם.</w:t>
             </w:r>
           </w:p>
         </w:tc>
@@ -506,7 +506,7 @@
                 <w:b w:val="0"/>
                 <w:sz w:val="22"/>
               </w:rPr>
-              <w:t>יצחק, תגיד לי, אתה קצת מתרגש כמוני? כי אני, ב"ה, פותחים פה משהו מיוחד.</w:t>
+              <w:t>אנחנו הולכים להיפגש כאן, יצחק ואני, למשך כמה וכמה פרקים. במסע משותף.</w:t>
             </w:r>
           </w:p>
         </w:tc>
@@ -587,7 +587,7 @@
                 <w:b w:val="0"/>
                 <w:sz w:val="22"/>
               </w:rPr>
-              <w:t>בהחלט. תראה, חיים, הקורס הזה הוא לא "עוד שיחה" שמדברת על איך לסדר את החיים. אנחנו פותחים מסע. מסע פנימי שעוסק בשאלה הכי בסיסית שיש.</w:t>
+              <w:t>ובמסע הזה נעסוק בשאלה אחת גדולה. שאלה שנשמעת פשוטה — אבל היא עמוקה מאוד: מי בעצם מנהיג את החיים שלנו?</w:t>
             </w:r>
           </w:p>
         </w:tc>
@@ -668,7 +668,7 @@
                 <w:b w:val="0"/>
                 <w:sz w:val="22"/>
               </w:rPr>
-              <w:t>אז בוא תשאל אותה כבר.</w:t>
+              <w:t>ובפרק הראשון, היום, אנחנו פותחים את היסודות. נכיר את הרעיון המרכזי של "מנהיגות תודעתית".</w:t>
             </w:r>
           </w:p>
         </w:tc>
@@ -749,7 +749,7 @@
                 <w:b w:val="0"/>
                 <w:sz w:val="22"/>
               </w:rPr>
-              <w:t>מי בעצם מנהיג את החיים שלנו?</w:t>
+              <w:t>נדבר על שלוש דרגות של תודעה, של מודעות, שכל אחד מאיתנו נע ביניהן. נבין למה אנחנו מוצאים את עצמנו, פעם אחר פעם, נופלים בדיוק באותם המקומות.</w:t>
             </w:r>
           </w:p>
         </w:tc>
@@ -830,7 +830,7 @@
                 <w:b w:val="0"/>
                 <w:sz w:val="22"/>
               </w:rPr>
-              <w:t>אוו, שאלה גדולה. אני אגיד לך, יצחק, אני שמעתי את השאלה הזאת ועצרתי לרגע. כי תחשוב — אני, ב"ה, מתפלל בכל יום, לומד בכל יום, מנהל את הבית, יושב בועד הבניין. כאילו אני המנהיג.</w:t>
+              <w:t>ובסוף השיחה, נשאיר לכם תרגיל קטן. אז כדאי כבר עכשיו להניח לידכם מחברת ועט.</w:t>
             </w:r>
           </w:p>
         </w:tc>
@@ -911,7 +911,7 @@
                 <w:b w:val="0"/>
                 <w:sz w:val="22"/>
               </w:rPr>
-              <w:t>אבל...?</w:t>
+              <w:t>יאללה, מעברון, ומתחילים בעז"ה.</w:t>
             </w:r>
           </w:p>
         </w:tc>
@@ -953,249 +953,6 @@
                 <w:sz w:val="22"/>
               </w:rPr>
               <w:t>10</w:t>
-            </w:r>
-          </w:p>
-        </w:tc>
-        <w:tc>
-          <w:tcPr>
-            <w:tcW w:type="dxa" w:w="2160"/>
-          </w:tcPr>
-          <w:p>
-            <w:pPr>
-              <w:jc w:val="right"/>
-              <w:bidi w:val="1"/>
-            </w:pPr>
-            <w:r/>
-            <w:r>
-              <w:rPr>
-                <w:rFonts w:ascii="David" w:hAnsi="David"/>
-                <w:b/>
-                <w:sz w:val="22"/>
-              </w:rPr>
-              <w:t>חיים</w:t>
-            </w:r>
-          </w:p>
-        </w:tc>
-        <w:tc>
-          <w:tcPr>
-            <w:tcW w:type="dxa" w:w="2160"/>
-          </w:tcPr>
-          <w:p>
-            <w:pPr>
-              <w:jc w:val="right"/>
-              <w:bidi w:val="1"/>
-            </w:pPr>
-            <w:r/>
-            <w:r>
-              <w:rPr>
-                <w:rFonts w:ascii="David" w:hAnsi="David"/>
-                <w:b w:val="0"/>
-                <w:sz w:val="22"/>
-              </w:rPr>
-              <w:t>אבל, פעם אחר פעם, אני מוצא את עצמי באותם המקומות בדיוק. אותו ילד שמוציא אותי מהכלים באותה צורה. אותה חמותי, השוויגער, שאומרת איזו מילה — וכבר השבת שלי קצת פחות שמחה.</w:t>
-            </w:r>
-          </w:p>
-        </w:tc>
-        <w:tc>
-          <w:tcPr>
-            <w:tcW w:type="dxa" w:w="2160"/>
-          </w:tcPr>
-          <w:p>
-            <w:pPr>
-              <w:jc w:val="right"/>
-              <w:bidi w:val="1"/>
-            </w:pPr>
-            <w:r/>
-            <w:r>
-              <w:rPr>
-                <w:rFonts w:ascii="David" w:hAnsi="David"/>
-                <w:b w:val="0"/>
-                <w:sz w:val="22"/>
-              </w:rPr>
-            </w:r>
-          </w:p>
-        </w:tc>
-      </w:tr>
-      <w:tr>
-        <w:tc>
-          <w:tcPr>
-            <w:tcW w:type="dxa" w:w="2160"/>
-          </w:tcPr>
-          <w:p>
-            <w:pPr>
-              <w:jc w:val="right"/>
-              <w:bidi w:val="1"/>
-            </w:pPr>
-            <w:r/>
-            <w:r>
-              <w:rPr>
-                <w:rFonts w:ascii="David" w:hAnsi="David"/>
-                <w:b w:val="0"/>
-                <w:sz w:val="22"/>
-              </w:rPr>
-              <w:t>11</w:t>
-            </w:r>
-          </w:p>
-        </w:tc>
-        <w:tc>
-          <w:tcPr>
-            <w:tcW w:type="dxa" w:w="2160"/>
-          </w:tcPr>
-          <w:p>
-            <w:pPr>
-              <w:jc w:val="right"/>
-              <w:bidi w:val="1"/>
-            </w:pPr>
-            <w:r/>
-            <w:r>
-              <w:rPr>
-                <w:rFonts w:ascii="David" w:hAnsi="David"/>
-                <w:b/>
-                <w:sz w:val="22"/>
-              </w:rPr>
-              <w:t>יצחק</w:t>
-            </w:r>
-          </w:p>
-        </w:tc>
-        <w:tc>
-          <w:tcPr>
-            <w:tcW w:type="dxa" w:w="2160"/>
-          </w:tcPr>
-          <w:p>
-            <w:pPr>
-              <w:jc w:val="right"/>
-              <w:bidi w:val="1"/>
-            </w:pPr>
-            <w:r/>
-            <w:r>
-              <w:rPr>
-                <w:rFonts w:ascii="David" w:hAnsi="David"/>
-                <w:b w:val="0"/>
-                <w:sz w:val="22"/>
-              </w:rPr>
-              <w:t>ובדיוק על זה אנחנו הולכים לדבר היום. ולא רק לדבר — להבין. כי בידינו, כל אחד ואחד, יש הרבה יותר ממה שאנחנו חושבים.</w:t>
-            </w:r>
-          </w:p>
-        </w:tc>
-        <w:tc>
-          <w:tcPr>
-            <w:tcW w:type="dxa" w:w="2160"/>
-          </w:tcPr>
-          <w:p>
-            <w:pPr>
-              <w:jc w:val="right"/>
-              <w:bidi w:val="1"/>
-            </w:pPr>
-            <w:r/>
-            <w:r>
-              <w:rPr>
-                <w:rFonts w:ascii="David" w:hAnsi="David"/>
-                <w:b w:val="0"/>
-                <w:sz w:val="22"/>
-              </w:rPr>
-            </w:r>
-          </w:p>
-        </w:tc>
-      </w:tr>
-      <w:tr>
-        <w:tc>
-          <w:tcPr>
-            <w:tcW w:type="dxa" w:w="2160"/>
-          </w:tcPr>
-          <w:p>
-            <w:pPr>
-              <w:jc w:val="right"/>
-              <w:bidi w:val="1"/>
-            </w:pPr>
-            <w:r/>
-            <w:r>
-              <w:rPr>
-                <w:rFonts w:ascii="David" w:hAnsi="David"/>
-                <w:b w:val="0"/>
-                <w:sz w:val="22"/>
-              </w:rPr>
-              <w:t>12</w:t>
-            </w:r>
-          </w:p>
-        </w:tc>
-        <w:tc>
-          <w:tcPr>
-            <w:tcW w:type="dxa" w:w="2160"/>
-          </w:tcPr>
-          <w:p>
-            <w:pPr>
-              <w:jc w:val="right"/>
-              <w:bidi w:val="1"/>
-            </w:pPr>
-            <w:r/>
-            <w:r>
-              <w:rPr>
-                <w:rFonts w:ascii="David" w:hAnsi="David"/>
-                <w:b/>
-                <w:sz w:val="22"/>
-              </w:rPr>
-              <w:t>חיים</w:t>
-            </w:r>
-          </w:p>
-        </w:tc>
-        <w:tc>
-          <w:tcPr>
-            <w:tcW w:type="dxa" w:w="2160"/>
-          </w:tcPr>
-          <w:p>
-            <w:pPr>
-              <w:jc w:val="right"/>
-              <w:bidi w:val="1"/>
-            </w:pPr>
-            <w:r/>
-            <w:r>
-              <w:rPr>
-                <w:rFonts w:ascii="David" w:hAnsi="David"/>
-                <w:b w:val="0"/>
-                <w:sz w:val="22"/>
-              </w:rPr>
-              <w:t>יאללה, מעברון, ומתחילים.</w:t>
-            </w:r>
-          </w:p>
-        </w:tc>
-        <w:tc>
-          <w:tcPr>
-            <w:tcW w:type="dxa" w:w="2160"/>
-          </w:tcPr>
-          <w:p>
-            <w:pPr>
-              <w:jc w:val="right"/>
-              <w:bidi w:val="1"/>
-            </w:pPr>
-            <w:r/>
-            <w:r>
-              <w:rPr>
-                <w:rFonts w:ascii="David" w:hAnsi="David"/>
-                <w:b w:val="0"/>
-                <w:sz w:val="22"/>
-              </w:rPr>
-            </w:r>
-          </w:p>
-        </w:tc>
-      </w:tr>
-      <w:tr>
-        <w:tc>
-          <w:tcPr>
-            <w:tcW w:type="dxa" w:w="2160"/>
-          </w:tcPr>
-          <w:p>
-            <w:pPr>
-              <w:jc w:val="right"/>
-              <w:bidi w:val="1"/>
-            </w:pPr>
-            <w:r/>
-            <w:r>
-              <w:rPr>
-                <w:rFonts w:ascii="David" w:hAnsi="David"/>
-                <w:b w:val="0"/>
-                <w:sz w:val="22"/>
-              </w:rPr>
-              <w:t>13</w:t>
             </w:r>
           </w:p>
         </w:tc>
@@ -1275,7 +1032,7 @@
                 <w:b w:val="0"/>
                 <w:sz w:val="22"/>
               </w:rPr>
-              <w:t>14</w:t>
+              <w:t>11</w:t>
             </w:r>
           </w:p>
         </w:tc>
@@ -1315,7 +1072,7 @@
                 <w:b w:val="0"/>
                 <w:sz w:val="22"/>
               </w:rPr>
-              <w:t>אני יצחק לוי, וכאן איתי חיים מנחם. ברוכים הבאים לקורס "מנהיגות תודעתית". התוכן שלפניכם מבוסס על מודלים מקצועיים בתחום הפיתוח האישי, ובעז"ה הותאם לציבור יראי ה'. במהלך השיחה נציע משימות לתרגול — תוכלו לבצע אותן בזמן ההאזנה, או לרשום במחברת לטובת המשך. הקורס מיועד לנשים וגברים כאחד.</w:t>
+              <w:t>אני יצחק לוי, וכאן איתי חיים מנחם. ברוכים הבאים לקורס "מנהיגות תודעתית". התוכן שלפניכם מבוסס על מודלים מקצועיים בתחום הפיתוח האישי, ובעז"ה הותאם לציבור יראי ה'. במהלך השיחה נציע משימות לתרגול — תוכלו לבצע אותן תוך כדי האזנה, או לרשום לעצמכם במחברת לטובת המשך. הקורס מיועד לנשים ולגברים כאחד.</w:t>
             </w:r>
           </w:p>
         </w:tc>
@@ -1357,7 +1114,7 @@
                 <w:b w:val="0"/>
                 <w:sz w:val="22"/>
               </w:rPr>
-              <w:t>15</w:t>
+              <w:t>12</w:t>
             </w:r>
           </w:p>
         </w:tc>
@@ -1397,7 +1154,250 @@
                 <w:b w:val="0"/>
                 <w:sz w:val="22"/>
               </w:rPr>
-              <w:t>טוב יצחק, אז נחזור לשאלה. למה זה קורה? למה אני נופל באותם המקומות שוב ושוב?</w:t>
+              <w:t>אז יצחק, אנחנו פה. ואני רוצה להתחיל מהמקום שלי, כמו שאני בא הביתה אחרי יום עבודה.</w:t>
+            </w:r>
+          </w:p>
+        </w:tc>
+        <w:tc>
+          <w:tcPr>
+            <w:tcW w:type="dxa" w:w="2160"/>
+          </w:tcPr>
+          <w:p>
+            <w:pPr>
+              <w:jc w:val="right"/>
+              <w:bidi w:val="1"/>
+            </w:pPr>
+            <w:r/>
+            <w:r>
+              <w:rPr>
+                <w:rFonts w:ascii="David" w:hAnsi="David"/>
+                <w:b w:val="0"/>
+                <w:sz w:val="22"/>
+              </w:rPr>
+            </w:r>
+          </w:p>
+        </w:tc>
+      </w:tr>
+      <w:tr>
+        <w:tc>
+          <w:tcPr>
+            <w:tcW w:type="dxa" w:w="2160"/>
+          </w:tcPr>
+          <w:p>
+            <w:pPr>
+              <w:jc w:val="right"/>
+              <w:bidi w:val="1"/>
+            </w:pPr>
+            <w:r/>
+            <w:r>
+              <w:rPr>
+                <w:rFonts w:ascii="David" w:hAnsi="David"/>
+                <w:b w:val="0"/>
+                <w:sz w:val="22"/>
+              </w:rPr>
+              <w:t>13</w:t>
+            </w:r>
+          </w:p>
+        </w:tc>
+        <w:tc>
+          <w:tcPr>
+            <w:tcW w:type="dxa" w:w="2160"/>
+          </w:tcPr>
+          <w:p>
+            <w:pPr>
+              <w:jc w:val="right"/>
+              <w:bidi w:val="1"/>
+            </w:pPr>
+            <w:r/>
+            <w:r>
+              <w:rPr>
+                <w:rFonts w:ascii="David" w:hAnsi="David"/>
+                <w:b/>
+                <w:sz w:val="22"/>
+              </w:rPr>
+              <w:t>יצחק</w:t>
+            </w:r>
+          </w:p>
+        </w:tc>
+        <w:tc>
+          <w:tcPr>
+            <w:tcW w:type="dxa" w:w="2160"/>
+          </w:tcPr>
+          <w:p>
+            <w:pPr>
+              <w:jc w:val="right"/>
+              <w:bidi w:val="1"/>
+            </w:pPr>
+            <w:r/>
+            <w:r>
+              <w:rPr>
+                <w:rFonts w:ascii="David" w:hAnsi="David"/>
+                <w:b w:val="0"/>
+                <w:sz w:val="22"/>
+              </w:rPr>
+              <w:t>בכבוד. תספר.</w:t>
+            </w:r>
+          </w:p>
+        </w:tc>
+        <w:tc>
+          <w:tcPr>
+            <w:tcW w:type="dxa" w:w="2160"/>
+          </w:tcPr>
+          <w:p>
+            <w:pPr>
+              <w:jc w:val="right"/>
+              <w:bidi w:val="1"/>
+            </w:pPr>
+            <w:r/>
+            <w:r>
+              <w:rPr>
+                <w:rFonts w:ascii="David" w:hAnsi="David"/>
+                <w:b w:val="0"/>
+                <w:sz w:val="22"/>
+              </w:rPr>
+            </w:r>
+          </w:p>
+        </w:tc>
+      </w:tr>
+      <w:tr>
+        <w:tc>
+          <w:tcPr>
+            <w:tcW w:type="dxa" w:w="2160"/>
+          </w:tcPr>
+          <w:p>
+            <w:pPr>
+              <w:jc w:val="right"/>
+              <w:bidi w:val="1"/>
+            </w:pPr>
+            <w:r/>
+            <w:r>
+              <w:rPr>
+                <w:rFonts w:ascii="David" w:hAnsi="David"/>
+                <w:b w:val="0"/>
+                <w:sz w:val="22"/>
+              </w:rPr>
+              <w:t>14</w:t>
+            </w:r>
+          </w:p>
+        </w:tc>
+        <w:tc>
+          <w:tcPr>
+            <w:tcW w:type="dxa" w:w="2160"/>
+          </w:tcPr>
+          <w:p>
+            <w:pPr>
+              <w:jc w:val="right"/>
+              <w:bidi w:val="1"/>
+            </w:pPr>
+            <w:r/>
+            <w:r>
+              <w:rPr>
+                <w:rFonts w:ascii="David" w:hAnsi="David"/>
+                <w:b/>
+                <w:sz w:val="22"/>
+              </w:rPr>
+              <w:t>חיים</w:t>
+            </w:r>
+          </w:p>
+        </w:tc>
+        <w:tc>
+          <w:tcPr>
+            <w:tcW w:type="dxa" w:w="2160"/>
+          </w:tcPr>
+          <w:p>
+            <w:pPr>
+              <w:jc w:val="right"/>
+              <w:bidi w:val="1"/>
+            </w:pPr>
+            <w:r/>
+            <w:r>
+              <w:rPr>
+                <w:rFonts w:ascii="David" w:hAnsi="David"/>
+                <w:b w:val="0"/>
+                <w:sz w:val="22"/>
+              </w:rPr>
+              <w:t>תחשוב על זה — אני, ב"ה, מתפלל שלוש תפילות ביום, קובע עיתים לתורה, מנהל את הבית, יושב בוועד הבניין. נראה לכאורה כאילו אני המנהיג.</w:t>
+            </w:r>
+          </w:p>
+        </w:tc>
+        <w:tc>
+          <w:tcPr>
+            <w:tcW w:type="dxa" w:w="2160"/>
+          </w:tcPr>
+          <w:p>
+            <w:pPr>
+              <w:jc w:val="right"/>
+              <w:bidi w:val="1"/>
+            </w:pPr>
+            <w:r/>
+            <w:r>
+              <w:rPr>
+                <w:rFonts w:ascii="David" w:hAnsi="David"/>
+                <w:b w:val="0"/>
+                <w:sz w:val="22"/>
+              </w:rPr>
+            </w:r>
+          </w:p>
+        </w:tc>
+      </w:tr>
+      <w:tr>
+        <w:tc>
+          <w:tcPr>
+            <w:tcW w:type="dxa" w:w="2160"/>
+          </w:tcPr>
+          <w:p>
+            <w:pPr>
+              <w:jc w:val="right"/>
+              <w:bidi w:val="1"/>
+            </w:pPr>
+            <w:r/>
+            <w:r>
+              <w:rPr>
+                <w:rFonts w:ascii="David" w:hAnsi="David"/>
+                <w:b w:val="0"/>
+                <w:sz w:val="22"/>
+              </w:rPr>
+              <w:t>15</w:t>
+            </w:r>
+          </w:p>
+        </w:tc>
+        <w:tc>
+          <w:tcPr>
+            <w:tcW w:type="dxa" w:w="2160"/>
+          </w:tcPr>
+          <w:p>
+            <w:pPr>
+              <w:jc w:val="right"/>
+              <w:bidi w:val="1"/>
+            </w:pPr>
+            <w:r/>
+            <w:r>
+              <w:rPr>
+                <w:rFonts w:ascii="David" w:hAnsi="David"/>
+                <w:b/>
+                <w:sz w:val="22"/>
+              </w:rPr>
+              <w:t>יצחק</w:t>
+            </w:r>
+          </w:p>
+        </w:tc>
+        <w:tc>
+          <w:tcPr>
+            <w:tcW w:type="dxa" w:w="2160"/>
+          </w:tcPr>
+          <w:p>
+            <w:pPr>
+              <w:jc w:val="right"/>
+              <w:bidi w:val="1"/>
+            </w:pPr>
+            <w:r/>
+            <w:r>
+              <w:rPr>
+                <w:rFonts w:ascii="David" w:hAnsi="David"/>
+                <w:b w:val="0"/>
+                <w:sz w:val="22"/>
+              </w:rPr>
+              <w:t>אבל...?</w:t>
             </w:r>
           </w:p>
         </w:tc>
@@ -1458,7 +1458,7 @@
                 <w:b/>
                 <w:sz w:val="22"/>
               </w:rPr>
-              <w:t>יצחק</w:t>
+              <w:t>חיים</w:t>
             </w:r>
           </w:p>
         </w:tc>
@@ -1478,7 +1478,7 @@
                 <w:b w:val="0"/>
                 <w:sz w:val="22"/>
               </w:rPr>
-              <w:t>בוא נתחיל מתמונה אחת. תחשוב על הילדים שלנו, חיים. כשתינוק נולד, יש בו טבע. הוא בוכה כשרעב, צוחק כשטוב לו. אין לו עדיין הרגלים, אין לו עדיין דפוסים.</w:t>
+              <w:t>אבל פעם אחר פעם, אני מוצא את עצמי נופל באותם המקומות בדיוק. אותו הילד שמצליח להוציא אותי מהכלים תמיד באותה הצורה. ואצל החמותי, השוויגער, אתה יודע — מספיק מילה אחת, וכבר השבת שלי קצת פחות שמחה.</w:t>
             </w:r>
           </w:p>
         </w:tc>
@@ -1539,7 +1539,7 @@
                 <w:b/>
                 <w:sz w:val="22"/>
               </w:rPr>
-              <w:t>חיים</w:t>
+              <w:t>יצחק</w:t>
             </w:r>
           </w:p>
         </w:tc>
@@ -1559,7 +1559,7 @@
                 <w:b w:val="0"/>
                 <w:sz w:val="22"/>
               </w:rPr>
-              <w:t>תאמין לי, אצלנו בבית, התינוק הקטן זאת בדיוק התמונה. אין מסכות, אין משחקים.</w:t>
+              <w:t>אני מכיר את התחושה הזאת היטב, חיים. וזה בדיוק הסימן שמשהו עמוק יותר עובד פה. משהו שהוא לא בהכרח אנחנו, אבל הוא חי בתוכנו.</w:t>
             </w:r>
           </w:p>
         </w:tc>
@@ -1620,7 +1620,7 @@
                 <w:b/>
                 <w:sz w:val="22"/>
               </w:rPr>
-              <w:t>יצחק</w:t>
+              <w:t>חיים</w:t>
             </w:r>
           </w:p>
         </w:tc>
@@ -1640,7 +1640,7 @@
                 <w:b w:val="0"/>
                 <w:sz w:val="22"/>
               </w:rPr>
-              <w:t>יפה. עכשיו תחשוב — מה קורה במשך השנים הראשונות? אנחנו לומדים. הילד לומד מאמא, מאבא, מהמלמד בחיידר, מהחברים. הוא לומד מה זה בסדר ומה זה לא בסדר. הוא לומד אילו רגשות מותר להראות ואילו לא.</w:t>
+              <w:t>אז בוא תסביר. מה זה הדבר הזה?</w:t>
             </w:r>
           </w:p>
         </w:tc>
@@ -1701,7 +1701,7 @@
                 <w:b/>
                 <w:sz w:val="22"/>
               </w:rPr>
-              <w:t>חיים</w:t>
+              <w:t>יצחק</w:t>
             </w:r>
           </w:p>
         </w:tc>
@@ -1721,7 +1721,7 @@
                 <w:b w:val="0"/>
                 <w:sz w:val="22"/>
               </w:rPr>
-              <w:t>בקיצור — בנפש שלו נחקקים חיווטים.</w:t>
+              <w:t>התשובה מתחילה בתמונה פשוטה אחת. תחשוב על תינוק שזה עתה נולד. מה יש בו? טבע פשוט. הוא בוכה כשרעב, צוחק כשטוב לו, ישן כשעייף. אין לו עדיין הרגלים, אין לו עדיין דפוסים.</w:t>
             </w:r>
           </w:p>
         </w:tc>
@@ -1782,7 +1782,7 @@
                 <w:b/>
                 <w:sz w:val="22"/>
               </w:rPr>
-              <w:t>יצחק</w:t>
+              <w:t>חיים</w:t>
             </w:r>
           </w:p>
         </w:tc>
@@ -1802,7 +1802,7 @@
                 <w:b w:val="0"/>
                 <w:sz w:val="22"/>
               </w:rPr>
-              <w:t>בדיוק המילה. חיווטים. כל אחד מאיתנו, איפה שהוא בעשור–עשור וחצי הראשונים של החיים, מקבל מערכת שלמה של דפוסי תגובה. ואחרי שהמערכת הזאת התחווטה — היא מתחילה לעבוד על "טייס אוטומטי".</w:t>
+              <w:t>תאמין לי, אצלנו בבית, התינוק הקטן זאת בדיוק התמונה. אין מסכות. אין משחקים. רק טבע.</w:t>
             </w:r>
           </w:p>
         </w:tc>
@@ -1863,7 +1863,7 @@
                 <w:b/>
                 <w:sz w:val="22"/>
               </w:rPr>
-              <w:t>חיים</w:t>
+              <w:t>יצחק</w:t>
             </w:r>
           </w:p>
         </w:tc>
@@ -1883,7 +1883,7 @@
                 <w:b w:val="0"/>
                 <w:sz w:val="22"/>
               </w:rPr>
-              <w:t>יצחק, זה בעצם מה שחז"ל קוראים לו "אדם נפעל לפי פעולותיו".</w:t>
+              <w:t>יפה. עכשיו תחשוב — מה קורה במשך השנים הראשונות? אנחנו לומדים. הילד לומד מאמא, מאבא, מהמלמד בחיידר, מהחברים בכיתה. הוא לומד מה זה בסדר ומה זה לא בסדר. הוא לומד אילו רגשות מותר להראות ואילו לא.</w:t>
             </w:r>
           </w:p>
         </w:tc>
@@ -1903,7 +1903,6 @@
                 <w:b w:val="0"/>
                 <w:sz w:val="22"/>
               </w:rPr>
-              <w:t>[ציטוט תורני – ליועצות הדת: ספר החינוך, מצווה ט"ז – "אחרי הפעולות נמשכים הלבבות". להתאמה.]</w:t>
             </w:r>
           </w:p>
         </w:tc>
@@ -1945,7 +1944,7 @@
                 <w:b/>
                 <w:sz w:val="22"/>
               </w:rPr>
-              <w:t>יצחק</w:t>
+              <w:t>חיים</w:t>
             </w:r>
           </w:p>
         </w:tc>
@@ -1965,7 +1964,7 @@
                 <w:b w:val="0"/>
                 <w:sz w:val="22"/>
               </w:rPr>
-              <w:t>יישר כוח. בדיוק על זה אנחנו מדברים. ההרגל הופך לטבע שני. ואז, כשהילד שלי קוטר על הצלחת, אני לא באמת מגיב לילד הזה, ברגע הזה. אני מגיב לפי הדפוס שכבר מחווט בי.</w:t>
+              <w:t>ובקיצור — בנפש שלו נחקקים חיווטים.</w:t>
             </w:r>
           </w:p>
         </w:tc>
@@ -2026,7 +2025,7 @@
                 <w:b/>
                 <w:sz w:val="22"/>
               </w:rPr>
-              <w:t>חיים</w:t>
+              <w:t>יצחק</w:t>
             </w:r>
           </w:p>
         </w:tc>
@@ -2046,7 +2045,7 @@
                 <w:b w:val="0"/>
                 <w:sz w:val="22"/>
               </w:rPr>
-              <w:t>אז רגע, יצחק, אם אני מבין נכון — אני בכלל לא בוחר עכשיו. אני פשוט מבצע משהו שהוחלט עליו עוד לפני עשרים שנה.</w:t>
+              <w:t>בדיוק המילה הנכונה. חיווטים. במשך עשור–עשור וחצי הראשונים בחיים, כל אחד מאיתנו מקבל מערכת שלמה של דפוסי תגובה. ואחרי שהמערכת הזאת התחווטה — היא מתחילה לעבוד על "טייס אוטומטי".</w:t>
             </w:r>
           </w:p>
         </w:tc>
@@ -2107,7 +2106,7 @@
                 <w:b/>
                 <w:sz w:val="22"/>
               </w:rPr>
-              <w:t>יצחק</w:t>
+              <w:t>חיים</w:t>
             </w:r>
           </w:p>
         </w:tc>
@@ -2127,7 +2126,7 @@
                 <w:b w:val="0"/>
                 <w:sz w:val="22"/>
               </w:rPr>
-              <w:t>בלשון הקורס קוראים לזה "תודעה ריאקטיבית".</w:t>
+              <w:t>יצחק, זה בעצם מה שחז"ל אומרים — "אחרי הפעולות נמשכים הלבבות".</w:t>
             </w:r>
           </w:p>
         </w:tc>
@@ -2147,6 +2146,7 @@
                 <w:b w:val="0"/>
                 <w:sz w:val="22"/>
               </w:rPr>
+              <w:t>[ציטוט תורני – ליועצות הדת: ספר החינוך, מצווה ט"ז – "אחרי הפעולות נמשכים הלבבות". להתאמה.]</w:t>
             </w:r>
           </w:p>
         </w:tc>
@@ -2188,7 +2188,7 @@
                 <w:b/>
                 <w:sz w:val="22"/>
               </w:rPr>
-              <w:t>חיים</w:t>
+              <w:t>יצחק</w:t>
             </w:r>
           </w:p>
         </w:tc>
@@ -2208,7 +2208,7 @@
                 <w:b w:val="0"/>
                 <w:sz w:val="22"/>
               </w:rPr>
-              <w:t>תודעה — זאת אומרת המודעות שלנו, איך אנחנו רואים את העולם.</w:t>
+              <w:t>יישר כוח, חיים. בדיוק על זה אנחנו מדברים. ההרגל הופך לטבע שני. ואז, כשהילד שלי קוטר על הצלחת — אני לא באמת מגיב לילד הזה, ברגע הזה. אני מגיב לפי הדפוס שכבר מחווט בי שנים רבות.</w:t>
             </w:r>
           </w:p>
         </w:tc>
@@ -2250,6 +2250,249 @@
                 <w:sz w:val="22"/>
               </w:rPr>
               <w:t>26</w:t>
+            </w:r>
+          </w:p>
+        </w:tc>
+        <w:tc>
+          <w:tcPr>
+            <w:tcW w:type="dxa" w:w="2160"/>
+          </w:tcPr>
+          <w:p>
+            <w:pPr>
+              <w:jc w:val="right"/>
+              <w:bidi w:val="1"/>
+            </w:pPr>
+            <w:r/>
+            <w:r>
+              <w:rPr>
+                <w:rFonts w:ascii="David" w:hAnsi="David"/>
+                <w:b/>
+                <w:sz w:val="22"/>
+              </w:rPr>
+              <w:t>חיים</w:t>
+            </w:r>
+          </w:p>
+        </w:tc>
+        <w:tc>
+          <w:tcPr>
+            <w:tcW w:type="dxa" w:w="2160"/>
+          </w:tcPr>
+          <w:p>
+            <w:pPr>
+              <w:jc w:val="right"/>
+              <w:bidi w:val="1"/>
+            </w:pPr>
+            <w:r/>
+            <w:r>
+              <w:rPr>
+                <w:rFonts w:ascii="David" w:hAnsi="David"/>
+                <w:b w:val="0"/>
+                <w:sz w:val="22"/>
+              </w:rPr>
+              <w:t>אז אם אני מבין נכון, יצחק — באותו רגע אני בכלל לא בוחר. אני פשוט מבצע משהו שהוחלט עליו עוד לפני שלושים שנה.</w:t>
+            </w:r>
+          </w:p>
+        </w:tc>
+        <w:tc>
+          <w:tcPr>
+            <w:tcW w:type="dxa" w:w="2160"/>
+          </w:tcPr>
+          <w:p>
+            <w:pPr>
+              <w:jc w:val="right"/>
+              <w:bidi w:val="1"/>
+            </w:pPr>
+            <w:r/>
+            <w:r>
+              <w:rPr>
+                <w:rFonts w:ascii="David" w:hAnsi="David"/>
+                <w:b w:val="0"/>
+                <w:sz w:val="22"/>
+              </w:rPr>
+            </w:r>
+          </w:p>
+        </w:tc>
+      </w:tr>
+      <w:tr>
+        <w:tc>
+          <w:tcPr>
+            <w:tcW w:type="dxa" w:w="2160"/>
+          </w:tcPr>
+          <w:p>
+            <w:pPr>
+              <w:jc w:val="right"/>
+              <w:bidi w:val="1"/>
+            </w:pPr>
+            <w:r/>
+            <w:r>
+              <w:rPr>
+                <w:rFonts w:ascii="David" w:hAnsi="David"/>
+                <w:b w:val="0"/>
+                <w:sz w:val="22"/>
+              </w:rPr>
+              <w:t>27</w:t>
+            </w:r>
+          </w:p>
+        </w:tc>
+        <w:tc>
+          <w:tcPr>
+            <w:tcW w:type="dxa" w:w="2160"/>
+          </w:tcPr>
+          <w:p>
+            <w:pPr>
+              <w:jc w:val="right"/>
+              <w:bidi w:val="1"/>
+            </w:pPr>
+            <w:r/>
+            <w:r>
+              <w:rPr>
+                <w:rFonts w:ascii="David" w:hAnsi="David"/>
+                <w:b/>
+                <w:sz w:val="22"/>
+              </w:rPr>
+              <w:t>יצחק</w:t>
+            </w:r>
+          </w:p>
+        </w:tc>
+        <w:tc>
+          <w:tcPr>
+            <w:tcW w:type="dxa" w:w="2160"/>
+          </w:tcPr>
+          <w:p>
+            <w:pPr>
+              <w:jc w:val="right"/>
+              <w:bidi w:val="1"/>
+            </w:pPr>
+            <w:r/>
+            <w:r>
+              <w:rPr>
+                <w:rFonts w:ascii="David" w:hAnsi="David"/>
+                <w:b w:val="0"/>
+                <w:sz w:val="22"/>
+              </w:rPr>
+              <w:t>בדיוק. ובלשון הקורס קוראים למצב הזה "תודעה ריאקטיבית".</w:t>
+            </w:r>
+          </w:p>
+        </w:tc>
+        <w:tc>
+          <w:tcPr>
+            <w:tcW w:type="dxa" w:w="2160"/>
+          </w:tcPr>
+          <w:p>
+            <w:pPr>
+              <w:jc w:val="right"/>
+              <w:bidi w:val="1"/>
+            </w:pPr>
+            <w:r/>
+            <w:r>
+              <w:rPr>
+                <w:rFonts w:ascii="David" w:hAnsi="David"/>
+                <w:b w:val="0"/>
+                <w:sz w:val="22"/>
+              </w:rPr>
+            </w:r>
+          </w:p>
+        </w:tc>
+      </w:tr>
+      <w:tr>
+        <w:tc>
+          <w:tcPr>
+            <w:tcW w:type="dxa" w:w="2160"/>
+          </w:tcPr>
+          <w:p>
+            <w:pPr>
+              <w:jc w:val="right"/>
+              <w:bidi w:val="1"/>
+            </w:pPr>
+            <w:r/>
+            <w:r>
+              <w:rPr>
+                <w:rFonts w:ascii="David" w:hAnsi="David"/>
+                <w:b w:val="0"/>
+                <w:sz w:val="22"/>
+              </w:rPr>
+              <w:t>28</w:t>
+            </w:r>
+          </w:p>
+        </w:tc>
+        <w:tc>
+          <w:tcPr>
+            <w:tcW w:type="dxa" w:w="2160"/>
+          </w:tcPr>
+          <w:p>
+            <w:pPr>
+              <w:jc w:val="right"/>
+              <w:bidi w:val="1"/>
+            </w:pPr>
+            <w:r/>
+            <w:r>
+              <w:rPr>
+                <w:rFonts w:ascii="David" w:hAnsi="David"/>
+                <w:b/>
+                <w:sz w:val="22"/>
+              </w:rPr>
+              <w:t>חיים</w:t>
+            </w:r>
+          </w:p>
+        </w:tc>
+        <w:tc>
+          <w:tcPr>
+            <w:tcW w:type="dxa" w:w="2160"/>
+          </w:tcPr>
+          <w:p>
+            <w:pPr>
+              <w:jc w:val="right"/>
+              <w:bidi w:val="1"/>
+            </w:pPr>
+            <w:r/>
+            <w:r>
+              <w:rPr>
+                <w:rFonts w:ascii="David" w:hAnsi="David"/>
+                <w:b w:val="0"/>
+                <w:sz w:val="22"/>
+              </w:rPr>
+              <w:t>רגע, נפרק את המילים. תודעה — זאת המודעות שלנו, האופן שבו אנחנו רואים את העולם.</w:t>
+            </w:r>
+          </w:p>
+        </w:tc>
+        <w:tc>
+          <w:tcPr>
+            <w:tcW w:type="dxa" w:w="2160"/>
+          </w:tcPr>
+          <w:p>
+            <w:pPr>
+              <w:jc w:val="right"/>
+              <w:bidi w:val="1"/>
+            </w:pPr>
+            <w:r/>
+            <w:r>
+              <w:rPr>
+                <w:rFonts w:ascii="David" w:hAnsi="David"/>
+                <w:b w:val="0"/>
+                <w:sz w:val="22"/>
+              </w:rPr>
+            </w:r>
+          </w:p>
+        </w:tc>
+      </w:tr>
+      <w:tr>
+        <w:tc>
+          <w:tcPr>
+            <w:tcW w:type="dxa" w:w="2160"/>
+          </w:tcPr>
+          <w:p>
+            <w:pPr>
+              <w:jc w:val="right"/>
+              <w:bidi w:val="1"/>
+            </w:pPr>
+            <w:r/>
+            <w:r>
+              <w:rPr>
+                <w:rFonts w:ascii="David" w:hAnsi="David"/>
+                <w:b w:val="0"/>
+                <w:sz w:val="22"/>
+              </w:rPr>
+              <w:t>29</w:t>
             </w:r>
           </w:p>
         </w:tc>
@@ -2330,7 +2573,7 @@
                 <w:b w:val="0"/>
                 <w:sz w:val="22"/>
               </w:rPr>
-              <w:t>27</w:t>
+              <w:t>30</w:t>
             </w:r>
           </w:p>
         </w:tc>
@@ -2370,7 +2613,7 @@
                 <w:b w:val="0"/>
                 <w:sz w:val="22"/>
               </w:rPr>
-              <w:t>במצב הזה אני בעצם לא מנהיג.</w:t>
+              <w:t>במצב הזה אני בעצם לא מנהיג של עצמי.</w:t>
             </w:r>
           </w:p>
         </w:tc>
@@ -2411,7 +2654,7 @@
                 <w:b w:val="0"/>
                 <w:sz w:val="22"/>
               </w:rPr>
-              <w:t>28</w:t>
+              <w:t>31</w:t>
             </w:r>
           </w:p>
         </w:tc>
@@ -2451,7 +2694,7 @@
                 <w:b w:val="0"/>
                 <w:sz w:val="22"/>
               </w:rPr>
-              <w:t>אפילו יותר מזה. במצב הזה אדם הוא — סלחו לי על הביטוי — קצת כמו בובה על חוטים. מישהו או משהו בחוץ מושך, ואני נע.</w:t>
+              <w:t>אפילו יותר מזה. במצב הזה האדם הוא — סלחו לי על הביטוי — קצת כמו בובה על חוטים. מישהו או משהו בחוץ מושך, ואני נע.</w:t>
             </w:r>
           </w:p>
         </w:tc>
@@ -2492,7 +2735,7 @@
                 <w:b w:val="0"/>
                 <w:sz w:val="22"/>
               </w:rPr>
-              <w:t>29</w:t>
+              <w:t>32</w:t>
             </w:r>
           </w:p>
         </w:tc>
@@ -2532,7 +2775,7 @@
                 <w:b w:val="0"/>
                 <w:sz w:val="22"/>
               </w:rPr>
-              <w:t>זה כואב לשמוע ככה, אבל אני חייב להודות שזה אמיתי.</w:t>
+              <w:t>זה כואב לשמוע ככה. אבל אני חייב להודות שזה אמיתי.</w:t>
             </w:r>
           </w:p>
         </w:tc>
@@ -2573,7 +2816,7 @@
                 <w:b w:val="0"/>
                 <w:sz w:val="22"/>
               </w:rPr>
-              <w:t>30</w:t>
+              <w:t>33</w:t>
             </w:r>
           </w:p>
         </w:tc>
@@ -2653,7 +2896,7 @@
                 <w:b w:val="0"/>
                 <w:sz w:val="22"/>
               </w:rPr>
-              <w:t>31</w:t>
+              <w:t>34</w:t>
             </w:r>
           </w:p>
         </w:tc>
@@ -2693,251 +2936,7 @@
                 <w:b w:val="0"/>
                 <w:sz w:val="22"/>
               </w:rPr>
-              <w:t>יצחק, נניח שאני מבין שאני נמצא הרבה במצב הזה, של "ריאקטיבי". מה השלב הבא? איך יוצאים מזה?</w:t>
-            </w:r>
-          </w:p>
-        </w:tc>
-        <w:tc>
-          <w:tcPr>
-            <w:tcW w:type="dxa" w:w="2160"/>
-          </w:tcPr>
-          <w:p>
-            <w:pPr>
-              <w:jc w:val="right"/>
-              <w:bidi w:val="1"/>
-            </w:pPr>
-            <w:r/>
-            <w:r>
-              <w:rPr>
-                <w:rFonts w:ascii="David" w:hAnsi="David"/>
-                <w:b w:val="0"/>
-                <w:sz w:val="22"/>
-              </w:rPr>
-            </w:r>
-          </w:p>
-        </w:tc>
-      </w:tr>
-      <w:tr>
-        <w:tc>
-          <w:tcPr>
-            <w:tcW w:type="dxa" w:w="2160"/>
-          </w:tcPr>
-          <w:p>
-            <w:pPr>
-              <w:jc w:val="right"/>
-              <w:bidi w:val="1"/>
-            </w:pPr>
-            <w:r/>
-            <w:r>
-              <w:rPr>
-                <w:rFonts w:ascii="David" w:hAnsi="David"/>
-                <w:b w:val="0"/>
-                <w:sz w:val="22"/>
-              </w:rPr>
-              <w:t>32</w:t>
-            </w:r>
-          </w:p>
-        </w:tc>
-        <w:tc>
-          <w:tcPr>
-            <w:tcW w:type="dxa" w:w="2160"/>
-          </w:tcPr>
-          <w:p>
-            <w:pPr>
-              <w:jc w:val="right"/>
-              <w:bidi w:val="1"/>
-            </w:pPr>
-            <w:r/>
-            <w:r>
-              <w:rPr>
-                <w:rFonts w:ascii="David" w:hAnsi="David"/>
-                <w:b/>
-                <w:sz w:val="22"/>
-              </w:rPr>
-              <w:t>יצחק</w:t>
-            </w:r>
-          </w:p>
-        </w:tc>
-        <w:tc>
-          <w:tcPr>
-            <w:tcW w:type="dxa" w:w="2160"/>
-          </w:tcPr>
-          <w:p>
-            <w:pPr>
-              <w:jc w:val="right"/>
-              <w:bidi w:val="1"/>
-            </w:pPr>
-            <w:r/>
-            <w:r>
-              <w:rPr>
-                <w:rFonts w:ascii="David" w:hAnsi="David"/>
-                <w:b w:val="0"/>
-                <w:sz w:val="22"/>
-              </w:rPr>
-              <w:t>השלב הבא נקרא "תודעה פרואקטיבית". המילה "פרו" אומרת "לפני". זאת אומרת — לפני שאני מגיב, יש שנייה אחת של בחירה.</w:t>
-            </w:r>
-          </w:p>
-        </w:tc>
-        <w:tc>
-          <w:tcPr>
-            <w:tcW w:type="dxa" w:w="2160"/>
-          </w:tcPr>
-          <w:p>
-            <w:pPr>
-              <w:jc w:val="right"/>
-              <w:bidi w:val="1"/>
-            </w:pPr>
-            <w:r/>
-            <w:r>
-              <w:rPr>
-                <w:rFonts w:ascii="David" w:hAnsi="David"/>
-                <w:b w:val="0"/>
-                <w:sz w:val="22"/>
-              </w:rPr>
-            </w:r>
-          </w:p>
-        </w:tc>
-      </w:tr>
-      <w:tr>
-        <w:tc>
-          <w:tcPr>
-            <w:tcW w:type="dxa" w:w="2160"/>
-          </w:tcPr>
-          <w:p>
-            <w:pPr>
-              <w:jc w:val="right"/>
-              <w:bidi w:val="1"/>
-            </w:pPr>
-            <w:r/>
-            <w:r>
-              <w:rPr>
-                <w:rFonts w:ascii="David" w:hAnsi="David"/>
-                <w:b w:val="0"/>
-                <w:sz w:val="22"/>
-              </w:rPr>
-              <w:t>33</w:t>
-            </w:r>
-          </w:p>
-        </w:tc>
-        <w:tc>
-          <w:tcPr>
-            <w:tcW w:type="dxa" w:w="2160"/>
-          </w:tcPr>
-          <w:p>
-            <w:pPr>
-              <w:jc w:val="right"/>
-              <w:bidi w:val="1"/>
-            </w:pPr>
-            <w:r/>
-            <w:r>
-              <w:rPr>
-                <w:rFonts w:ascii="David" w:hAnsi="David"/>
-                <w:b/>
-                <w:sz w:val="22"/>
-              </w:rPr>
-              <w:t>חיים</w:t>
-            </w:r>
-          </w:p>
-        </w:tc>
-        <w:tc>
-          <w:tcPr>
-            <w:tcW w:type="dxa" w:w="2160"/>
-          </w:tcPr>
-          <w:p>
-            <w:pPr>
-              <w:jc w:val="right"/>
-              <w:bidi w:val="1"/>
-            </w:pPr>
-            <w:r/>
-            <w:r>
-              <w:rPr>
-                <w:rFonts w:ascii="David" w:hAnsi="David"/>
-                <w:b w:val="0"/>
-                <w:sz w:val="22"/>
-              </w:rPr>
-              <w:t>רגע, יצחק, זה בדיוק מה שלימדנו אותנו רבותינו. הרי כל מעלת האדם זה הבחירה החופשית.</w:t>
-            </w:r>
-          </w:p>
-        </w:tc>
-        <w:tc>
-          <w:tcPr>
-            <w:tcW w:type="dxa" w:w="2160"/>
-          </w:tcPr>
-          <w:p>
-            <w:pPr>
-              <w:jc w:val="right"/>
-              <w:bidi w:val="1"/>
-            </w:pPr>
-            <w:r/>
-            <w:r>
-              <w:rPr>
-                <w:rFonts w:ascii="David" w:hAnsi="David"/>
-                <w:b w:val="0"/>
-                <w:sz w:val="22"/>
-              </w:rPr>
-              <w:t>[ציטוט תורני – ליועצות הדת: רמב"ם הלכות תשובה פרק ה' – "רשות לכל אדם נתונה". או "ובחרת בחיים" – דברים ל'.]</w:t>
-            </w:r>
-          </w:p>
-        </w:tc>
-      </w:tr>
-      <w:tr>
-        <w:tc>
-          <w:tcPr>
-            <w:tcW w:type="dxa" w:w="2160"/>
-          </w:tcPr>
-          <w:p>
-            <w:pPr>
-              <w:jc w:val="right"/>
-              <w:bidi w:val="1"/>
-            </w:pPr>
-            <w:r/>
-            <w:r>
-              <w:rPr>
-                <w:rFonts w:ascii="David" w:hAnsi="David"/>
-                <w:b w:val="0"/>
-                <w:sz w:val="22"/>
-              </w:rPr>
-              <w:t>34</w:t>
-            </w:r>
-          </w:p>
-        </w:tc>
-        <w:tc>
-          <w:tcPr>
-            <w:tcW w:type="dxa" w:w="2160"/>
-          </w:tcPr>
-          <w:p>
-            <w:pPr>
-              <w:jc w:val="right"/>
-              <w:bidi w:val="1"/>
-            </w:pPr>
-            <w:r/>
-            <w:r>
-              <w:rPr>
-                <w:rFonts w:ascii="David" w:hAnsi="David"/>
-                <w:b/>
-                <w:sz w:val="22"/>
-              </w:rPr>
-              <w:t>יצחק</w:t>
-            </w:r>
-          </w:p>
-        </w:tc>
-        <w:tc>
-          <w:tcPr>
-            <w:tcW w:type="dxa" w:w="2160"/>
-          </w:tcPr>
-          <w:p>
-            <w:pPr>
-              <w:jc w:val="right"/>
-              <w:bidi w:val="1"/>
-            </w:pPr>
-            <w:r/>
-            <w:r>
-              <w:rPr>
-                <w:rFonts w:ascii="David" w:hAnsi="David"/>
-                <w:b w:val="0"/>
-                <w:sz w:val="22"/>
-              </w:rPr>
-              <w:t>ממש כך. תודעה פרואקטיבית אומרת: המציאות בחוץ זאת אותה מציאות. הילד עושה את אותו רעש. אבל בפנים שלי יש רגע אחד — של שקט נפשי, של חופש, שבו אני יכול לבחור איך להגיב.</w:t>
+              <w:t>אז יצחק, נניח שאני מבין שאני נמצא הרבה במצב הזה — של "תודעה ריאקטיבית". מה השלב הבא? איך יוצאים מזה?</w:t>
             </w:r>
           </w:p>
         </w:tc>
@@ -2998,7 +2997,7 @@
                 <w:b/>
                 <w:sz w:val="22"/>
               </w:rPr>
-              <w:t>חיים</w:t>
+              <w:t>יצחק</w:t>
             </w:r>
           </w:p>
         </w:tc>
@@ -3018,7 +3017,7 @@
                 <w:b w:val="0"/>
                 <w:sz w:val="22"/>
               </w:rPr>
-              <w:t>אז רגע. אם אני אבחר נכון, אני בעצם הופך מ"בובה על חוטים" — לאדם בוגר.</w:t>
+              <w:t>השלב הבא נקרא "תודעה פרואקטיבית". המילה "פרו" באה מלשון "לפני". זאת אומרת — לפני שאני מגיב, יש שנייה אחת. שנייה אחת של בחירה.</w:t>
             </w:r>
           </w:p>
         </w:tc>
@@ -3079,7 +3078,7 @@
                 <w:b/>
                 <w:sz w:val="22"/>
               </w:rPr>
-              <w:t>יצחק</w:t>
+              <w:t>חיים</w:t>
             </w:r>
           </w:p>
         </w:tc>
@@ -3099,7 +3098,7 @@
                 <w:b w:val="0"/>
                 <w:sz w:val="22"/>
               </w:rPr>
-              <w:t>אדם שהוא באמת מנהיג. אבל יצחק, עוד לא הגענו לסוף. יש שלב שלישי, ובעיני זה השלב היפה ביותר.</w:t>
+              <w:t>רגע, יצחק. זה בדיוק מה שלימדו אותנו רבותינו. הרי כל מעלת האדם — הבחירה החופשית.</w:t>
             </w:r>
           </w:p>
         </w:tc>
@@ -3119,6 +3118,7 @@
                 <w:b w:val="0"/>
                 <w:sz w:val="22"/>
               </w:rPr>
+              <w:t>[ציטוט תורני – ליועצות הדת: רמב"ם הלכות תשובה פרק ה' – "רשות לכל אדם נתונה". או "ובחרת בחיים" – דברים ל'.]</w:t>
             </w:r>
           </w:p>
         </w:tc>
@@ -3160,7 +3160,7 @@
                 <w:b/>
                 <w:sz w:val="22"/>
               </w:rPr>
-              <w:t>חיים</w:t>
+              <w:t>יצחק</w:t>
             </w:r>
           </w:p>
         </w:tc>
@@ -3180,7 +3180,7 @@
                 <w:b w:val="0"/>
                 <w:sz w:val="22"/>
               </w:rPr>
-              <w:t>תספר.</w:t>
+              <w:t>ממש כך, חיים. תודעה פרואקטיבית אומרת: המציאות בחוץ — אותה המציאות. הילד עושה את אותו הרעש. אבל בפנים שלי יש רגע אחד. רגע של שקט נפשי, של חופש, שבו אני יכול לבחור איך להגיב.</w:t>
             </w:r>
           </w:p>
         </w:tc>
@@ -3222,6 +3222,249 @@
                 <w:sz w:val="22"/>
               </w:rPr>
               <w:t>38</w:t>
+            </w:r>
+          </w:p>
+        </w:tc>
+        <w:tc>
+          <w:tcPr>
+            <w:tcW w:type="dxa" w:w="2160"/>
+          </w:tcPr>
+          <w:p>
+            <w:pPr>
+              <w:jc w:val="right"/>
+              <w:bidi w:val="1"/>
+            </w:pPr>
+            <w:r/>
+            <w:r>
+              <w:rPr>
+                <w:rFonts w:ascii="David" w:hAnsi="David"/>
+                <w:b/>
+                <w:sz w:val="22"/>
+              </w:rPr>
+              <w:t>חיים</w:t>
+            </w:r>
+          </w:p>
+        </w:tc>
+        <w:tc>
+          <w:tcPr>
+            <w:tcW w:type="dxa" w:w="2160"/>
+          </w:tcPr>
+          <w:p>
+            <w:pPr>
+              <w:jc w:val="right"/>
+              <w:bidi w:val="1"/>
+            </w:pPr>
+            <w:r/>
+            <w:r>
+              <w:rPr>
+                <w:rFonts w:ascii="David" w:hAnsi="David"/>
+                <w:b w:val="0"/>
+                <w:sz w:val="22"/>
+              </w:rPr>
+              <w:t>אז אם אני אבחר נכון באותו רגע — אני בעצם הופך מ"בובה על חוטים" לאדם בוגר. לאדם של בחירה.</w:t>
+            </w:r>
+          </w:p>
+        </w:tc>
+        <w:tc>
+          <w:tcPr>
+            <w:tcW w:type="dxa" w:w="2160"/>
+          </w:tcPr>
+          <w:p>
+            <w:pPr>
+              <w:jc w:val="right"/>
+              <w:bidi w:val="1"/>
+            </w:pPr>
+            <w:r/>
+            <w:r>
+              <w:rPr>
+                <w:rFonts w:ascii="David" w:hAnsi="David"/>
+                <w:b w:val="0"/>
+                <w:sz w:val="22"/>
+              </w:rPr>
+            </w:r>
+          </w:p>
+        </w:tc>
+      </w:tr>
+      <w:tr>
+        <w:tc>
+          <w:tcPr>
+            <w:tcW w:type="dxa" w:w="2160"/>
+          </w:tcPr>
+          <w:p>
+            <w:pPr>
+              <w:jc w:val="right"/>
+              <w:bidi w:val="1"/>
+            </w:pPr>
+            <w:r/>
+            <w:r>
+              <w:rPr>
+                <w:rFonts w:ascii="David" w:hAnsi="David"/>
+                <w:b w:val="0"/>
+                <w:sz w:val="22"/>
+              </w:rPr>
+              <w:t>39</w:t>
+            </w:r>
+          </w:p>
+        </w:tc>
+        <w:tc>
+          <w:tcPr>
+            <w:tcW w:type="dxa" w:w="2160"/>
+          </w:tcPr>
+          <w:p>
+            <w:pPr>
+              <w:jc w:val="right"/>
+              <w:bidi w:val="1"/>
+            </w:pPr>
+            <w:r/>
+            <w:r>
+              <w:rPr>
+                <w:rFonts w:ascii="David" w:hAnsi="David"/>
+                <w:b/>
+                <w:sz w:val="22"/>
+              </w:rPr>
+              <w:t>יצחק</w:t>
+            </w:r>
+          </w:p>
+        </w:tc>
+        <w:tc>
+          <w:tcPr>
+            <w:tcW w:type="dxa" w:w="2160"/>
+          </w:tcPr>
+          <w:p>
+            <w:pPr>
+              <w:jc w:val="right"/>
+              <w:bidi w:val="1"/>
+            </w:pPr>
+            <w:r/>
+            <w:r>
+              <w:rPr>
+                <w:rFonts w:ascii="David" w:hAnsi="David"/>
+                <w:b w:val="0"/>
+                <w:sz w:val="22"/>
+              </w:rPr>
+              <w:t>לאדם שהוא באמת מנהיג של עצמו. אבל חיים, עוד לא הגענו לסוף. יש שלב שלישי. ובעיניי — זה השלב היפה ביותר.</w:t>
+            </w:r>
+          </w:p>
+        </w:tc>
+        <w:tc>
+          <w:tcPr>
+            <w:tcW w:type="dxa" w:w="2160"/>
+          </w:tcPr>
+          <w:p>
+            <w:pPr>
+              <w:jc w:val="right"/>
+              <w:bidi w:val="1"/>
+            </w:pPr>
+            <w:r/>
+            <w:r>
+              <w:rPr>
+                <w:rFonts w:ascii="David" w:hAnsi="David"/>
+                <w:b w:val="0"/>
+                <w:sz w:val="22"/>
+              </w:rPr>
+            </w:r>
+          </w:p>
+        </w:tc>
+      </w:tr>
+      <w:tr>
+        <w:tc>
+          <w:tcPr>
+            <w:tcW w:type="dxa" w:w="2160"/>
+          </w:tcPr>
+          <w:p>
+            <w:pPr>
+              <w:jc w:val="right"/>
+              <w:bidi w:val="1"/>
+            </w:pPr>
+            <w:r/>
+            <w:r>
+              <w:rPr>
+                <w:rFonts w:ascii="David" w:hAnsi="David"/>
+                <w:b w:val="0"/>
+                <w:sz w:val="22"/>
+              </w:rPr>
+              <w:t>40</w:t>
+            </w:r>
+          </w:p>
+        </w:tc>
+        <w:tc>
+          <w:tcPr>
+            <w:tcW w:type="dxa" w:w="2160"/>
+          </w:tcPr>
+          <w:p>
+            <w:pPr>
+              <w:jc w:val="right"/>
+              <w:bidi w:val="1"/>
+            </w:pPr>
+            <w:r/>
+            <w:r>
+              <w:rPr>
+                <w:rFonts w:ascii="David" w:hAnsi="David"/>
+                <w:b/>
+                <w:sz w:val="22"/>
+              </w:rPr>
+              <w:t>חיים</w:t>
+            </w:r>
+          </w:p>
+        </w:tc>
+        <w:tc>
+          <w:tcPr>
+            <w:tcW w:type="dxa" w:w="2160"/>
+          </w:tcPr>
+          <w:p>
+            <w:pPr>
+              <w:jc w:val="right"/>
+              <w:bidi w:val="1"/>
+            </w:pPr>
+            <w:r/>
+            <w:r>
+              <w:rPr>
+                <w:rFonts w:ascii="David" w:hAnsi="David"/>
+                <w:b w:val="0"/>
+                <w:sz w:val="22"/>
+              </w:rPr>
+              <w:t>אני סקרן. תספר.</w:t>
+            </w:r>
+          </w:p>
+        </w:tc>
+        <w:tc>
+          <w:tcPr>
+            <w:tcW w:type="dxa" w:w="2160"/>
+          </w:tcPr>
+          <w:p>
+            <w:pPr>
+              <w:jc w:val="right"/>
+              <w:bidi w:val="1"/>
+            </w:pPr>
+            <w:r/>
+            <w:r>
+              <w:rPr>
+                <w:rFonts w:ascii="David" w:hAnsi="David"/>
+                <w:b w:val="0"/>
+                <w:sz w:val="22"/>
+              </w:rPr>
+            </w:r>
+          </w:p>
+        </w:tc>
+      </w:tr>
+      <w:tr>
+        <w:tc>
+          <w:tcPr>
+            <w:tcW w:type="dxa" w:w="2160"/>
+          </w:tcPr>
+          <w:p>
+            <w:pPr>
+              <w:jc w:val="right"/>
+              <w:bidi w:val="1"/>
+            </w:pPr>
+            <w:r/>
+            <w:r>
+              <w:rPr>
+                <w:rFonts w:ascii="David" w:hAnsi="David"/>
+                <w:b w:val="0"/>
+                <w:sz w:val="22"/>
+              </w:rPr>
+              <w:t>41</w:t>
             </w:r>
           </w:p>
         </w:tc>
@@ -3302,7 +3545,7 @@
                 <w:b w:val="0"/>
                 <w:sz w:val="22"/>
               </w:rPr>
-              <w:t>39</w:t>
+              <w:t>42</w:t>
             </w:r>
           </w:p>
         </w:tc>
@@ -3342,7 +3585,7 @@
                 <w:b w:val="0"/>
                 <w:sz w:val="22"/>
               </w:rPr>
-              <w:t>יצחק, אני חייב לעצור פה. כי זה נשמע גדול מאוד. בורא? יוצר? הרי בורא עולם הוא לבד היוצר.</w:t>
+              <w:t>יצחק, אני חייב לעצור פה. כי זה נשמע גדול מאוד. בורא? יוצר? הרי בורא עולם הוא לבדו היוצר.</w:t>
             </w:r>
           </w:p>
         </w:tc>
@@ -3383,7 +3626,7 @@
                 <w:b w:val="0"/>
                 <w:sz w:val="22"/>
               </w:rPr>
-              <w:t>40</w:t>
+              <w:t>43</w:t>
             </w:r>
           </w:p>
         </w:tc>
@@ -3423,7 +3666,7 @@
                 <w:b w:val="0"/>
                 <w:sz w:val="22"/>
               </w:rPr>
-              <w:t>שאלה חשובה מאוד, חיים. ובאמת — אנחנו לא בוראים יש מאין. בורא עולם זה רק הקב"ה. אנחנו מדברים על משהו אחר.</w:t>
+              <w:t>שאלה חשובה מאוד, חיים. ובאמת — אנחנו לא בוראים יש מאין. בורא עולם, ה' יתברך, הוא לבדו הבורא. אנחנו מדברים על משהו אחר.</w:t>
             </w:r>
           </w:p>
         </w:tc>
@@ -3464,7 +3707,7 @@
                 <w:b w:val="0"/>
                 <w:sz w:val="22"/>
               </w:rPr>
-              <w:t>41</w:t>
+              <w:t>44</w:t>
             </w:r>
           </w:p>
         </w:tc>
@@ -3545,7 +3788,7 @@
                 <w:b w:val="0"/>
                 <w:sz w:val="22"/>
               </w:rPr>
-              <w:t>42</w:t>
+              <w:t>45</w:t>
             </w:r>
           </w:p>
         </w:tc>
@@ -3585,7 +3828,7 @@
                 <w:b w:val="0"/>
                 <w:sz w:val="22"/>
               </w:rPr>
-              <w:t>אנחנו מדברים על הכוח שניתן לאדם להיות "צלם אלוקים". להיות יוצר במובן הקטן — לבנות בית, לחנך ילד, לפתח מידה טובה. הקב"ה נתן לנו את הכוח הזה.</w:t>
+              <w:t>על הכוח שניתן לאדם להיות "צלם אלוקים". להיות יוצר במובן הקטן — לבנות בית, לחנך ילד, לפתח מידה טובה, להמשיך טוב לעולם. הקב"ה נתן לנו את הכוח הזה.</w:t>
             </w:r>
           </w:p>
         </w:tc>
@@ -3627,7 +3870,7 @@
                 <w:b w:val="0"/>
                 <w:sz w:val="22"/>
               </w:rPr>
-              <w:t>43</w:t>
+              <w:t>46</w:t>
             </w:r>
           </w:p>
         </w:tc>
@@ -3667,7 +3910,7 @@
                 <w:b w:val="0"/>
                 <w:sz w:val="22"/>
               </w:rPr>
-              <w:t>אהבתי. אז התודעה הקריאטיבית, אם אני מבין, אומרת — לא רק אני בוחר איך להגיב לחיים. אלא אני מתחיל להחליט מראש איזה חיים אני רוצה לעצב.</w:t>
+              <w:t>אהבתי את הניסוח הזה. אז התודעה הקריאטיבית, אם אני מבין, אומרת — לא רק שאני בוחר איך להגיב לחיים. אלא אני מתחיל להחליט מראש איזה חיים אני רוצה לעצב.</w:t>
             </w:r>
           </w:p>
         </w:tc>
@@ -3708,7 +3951,7 @@
                 <w:b w:val="0"/>
                 <w:sz w:val="22"/>
               </w:rPr>
-              <w:t>44</w:t>
+              <w:t>47</w:t>
             </w:r>
           </w:p>
         </w:tc>
@@ -3748,7 +3991,7 @@
                 <w:b w:val="0"/>
                 <w:sz w:val="22"/>
               </w:rPr>
-              <w:t>בדיוק. ויש פה דבר עמוק מאוד. כל דבר בעולם — נברא פעמיים. פעם ראשונה במחשבה, פעם שנייה במציאות.</w:t>
+              <w:t>בדיוק. ויש פה דבר עמוק מאוד. כל דבר בעולם נברא פעמיים. פעם ראשונה במחשבה. פעם שנייה במציאות.</w:t>
             </w:r>
           </w:p>
         </w:tc>
@@ -3789,7 +4032,7 @@
                 <w:b w:val="0"/>
                 <w:sz w:val="22"/>
               </w:rPr>
-              <w:t>45</w:t>
+              <w:t>48</w:t>
             </w:r>
           </w:p>
         </w:tc>
@@ -3829,7 +4072,7 @@
                 <w:b w:val="0"/>
                 <w:sz w:val="22"/>
               </w:rPr>
-              <w:t>זאת אומרת, אם אני רוצה בית של שלום בית, של תורה, של שמחה — קודם זה צריך להיברא בתוכי. במחשבה, בתודעה. ורק אחר כך זה יבוא לידי ביטוי בפועל.</w:t>
+              <w:t>זאת אומרת — אם אני רוצה בית של שלום בית, של תורה, של שמחה — קודם זה צריך להיברא בתוכי. במחשבה. בתודעה. ורק אחר כך זה יבוא לידי ביטוי בפועל.</w:t>
             </w:r>
           </w:p>
         </w:tc>
@@ -3870,7 +4113,7 @@
                 <w:b w:val="0"/>
                 <w:sz w:val="22"/>
               </w:rPr>
-              <w:t>46</w:t>
+              <w:t>49</w:t>
             </w:r>
           </w:p>
         </w:tc>
@@ -3952,7 +4195,7 @@
                 <w:b w:val="0"/>
                 <w:sz w:val="22"/>
               </w:rPr>
-              <w:t>47</w:t>
+              <w:t>50</w:t>
             </w:r>
           </w:p>
         </w:tc>
@@ -4032,7 +4275,7 @@
                 <w:b w:val="0"/>
                 <w:sz w:val="22"/>
               </w:rPr>
-              <w:t>48</w:t>
+              <w:t>51</w:t>
             </w:r>
           </w:p>
         </w:tc>
@@ -4072,7 +4315,7 @@
                 <w:b w:val="0"/>
                 <w:sz w:val="22"/>
               </w:rPr>
-              <w:t>יצחק, בוא נסכם בקצרה לפני שאנחנו מציעים למאזינים את התרגיל הראשון של הקורס.</w:t>
+              <w:t>יצחק, בוא נסכם בקצרה. ואחר כך נציע למאזינים את התרגיל הראשון של הקורס.</w:t>
             </w:r>
           </w:p>
         </w:tc>
@@ -4113,7 +4356,7 @@
                 <w:b w:val="0"/>
                 <w:sz w:val="22"/>
               </w:rPr>
-              <w:t>49</w:t>
+              <w:t>52</w:t>
             </w:r>
           </w:p>
         </w:tc>
@@ -4194,7 +4437,7 @@
                 <w:b w:val="0"/>
                 <w:sz w:val="22"/>
               </w:rPr>
-              <w:t>50</w:t>
+              <w:t>53</w:t>
             </w:r>
           </w:p>
         </w:tc>
@@ -4234,250 +4477,7 @@
                 <w:b w:val="0"/>
                 <w:sz w:val="22"/>
               </w:rPr>
-              <w:t>אחד — תודעה ריאקטיבית. מצב של "טייס אוטומטי", של תגובה לפי דפוסים.</w:t>
-            </w:r>
-          </w:p>
-        </w:tc>
-        <w:tc>
-          <w:tcPr>
-            <w:tcW w:type="dxa" w:w="2160"/>
-          </w:tcPr>
-          <w:p>
-            <w:pPr>
-              <w:jc w:val="right"/>
-              <w:bidi w:val="1"/>
-            </w:pPr>
-            <w:r/>
-            <w:r>
-              <w:rPr>
-                <w:rFonts w:ascii="David" w:hAnsi="David"/>
-                <w:b w:val="0"/>
-                <w:sz w:val="22"/>
-              </w:rPr>
-            </w:r>
-          </w:p>
-        </w:tc>
-      </w:tr>
-      <w:tr>
-        <w:tc>
-          <w:tcPr>
-            <w:tcW w:type="dxa" w:w="2160"/>
-          </w:tcPr>
-          <w:p>
-            <w:pPr>
-              <w:jc w:val="right"/>
-              <w:bidi w:val="1"/>
-            </w:pPr>
-            <w:r/>
-            <w:r>
-              <w:rPr>
-                <w:rFonts w:ascii="David" w:hAnsi="David"/>
-                <w:b w:val="0"/>
-                <w:sz w:val="22"/>
-              </w:rPr>
-              <w:t>51</w:t>
-            </w:r>
-          </w:p>
-        </w:tc>
-        <w:tc>
-          <w:tcPr>
-            <w:tcW w:type="dxa" w:w="2160"/>
-          </w:tcPr>
-          <w:p>
-            <w:pPr>
-              <w:jc w:val="right"/>
-              <w:bidi w:val="1"/>
-            </w:pPr>
-            <w:r/>
-            <w:r>
-              <w:rPr>
-                <w:rFonts w:ascii="David" w:hAnsi="David"/>
-                <w:b/>
-                <w:sz w:val="22"/>
-              </w:rPr>
-              <w:t>יצחק</w:t>
-            </w:r>
-          </w:p>
-        </w:tc>
-        <w:tc>
-          <w:tcPr>
-            <w:tcW w:type="dxa" w:w="2160"/>
-          </w:tcPr>
-          <w:p>
-            <w:pPr>
-              <w:jc w:val="right"/>
-              <w:bidi w:val="1"/>
-            </w:pPr>
-            <w:r/>
-            <w:r>
-              <w:rPr>
-                <w:rFonts w:ascii="David" w:hAnsi="David"/>
-                <w:b w:val="0"/>
-                <w:sz w:val="22"/>
-              </w:rPr>
-              <w:t>שתיים — תודעה פרואקטיבית. מצב של בחירה חופשית, של אחריות, של שקט פנימי גם בתוך הסערה.</w:t>
-            </w:r>
-          </w:p>
-        </w:tc>
-        <w:tc>
-          <w:tcPr>
-            <w:tcW w:type="dxa" w:w="2160"/>
-          </w:tcPr>
-          <w:p>
-            <w:pPr>
-              <w:jc w:val="right"/>
-              <w:bidi w:val="1"/>
-            </w:pPr>
-            <w:r/>
-            <w:r>
-              <w:rPr>
-                <w:rFonts w:ascii="David" w:hAnsi="David"/>
-                <w:b w:val="0"/>
-                <w:sz w:val="22"/>
-              </w:rPr>
-            </w:r>
-          </w:p>
-        </w:tc>
-      </w:tr>
-      <w:tr>
-        <w:tc>
-          <w:tcPr>
-            <w:tcW w:type="dxa" w:w="2160"/>
-          </w:tcPr>
-          <w:p>
-            <w:pPr>
-              <w:jc w:val="right"/>
-              <w:bidi w:val="1"/>
-            </w:pPr>
-            <w:r/>
-            <w:r>
-              <w:rPr>
-                <w:rFonts w:ascii="David" w:hAnsi="David"/>
-                <w:b w:val="0"/>
-                <w:sz w:val="22"/>
-              </w:rPr>
-              <w:t>52</w:t>
-            </w:r>
-          </w:p>
-        </w:tc>
-        <w:tc>
-          <w:tcPr>
-            <w:tcW w:type="dxa" w:w="2160"/>
-          </w:tcPr>
-          <w:p>
-            <w:pPr>
-              <w:jc w:val="right"/>
-              <w:bidi w:val="1"/>
-            </w:pPr>
-            <w:r/>
-            <w:r>
-              <w:rPr>
-                <w:rFonts w:ascii="David" w:hAnsi="David"/>
-                <w:b/>
-                <w:sz w:val="22"/>
-              </w:rPr>
-              <w:t>חיים</w:t>
-            </w:r>
-          </w:p>
-        </w:tc>
-        <w:tc>
-          <w:tcPr>
-            <w:tcW w:type="dxa" w:w="2160"/>
-          </w:tcPr>
-          <w:p>
-            <w:pPr>
-              <w:jc w:val="right"/>
-              <w:bidi w:val="1"/>
-            </w:pPr>
-            <w:r/>
-            <w:r>
-              <w:rPr>
-                <w:rFonts w:ascii="David" w:hAnsi="David"/>
-                <w:b w:val="0"/>
-                <w:sz w:val="22"/>
-              </w:rPr>
-              <w:t>ושלוש — תודעה קריאטיבית. מצב שבו אני מנהיג ויוצר, ברוח של "צלם אלוקים", את החיים שאני רוצה לחיות.</w:t>
-            </w:r>
-          </w:p>
-        </w:tc>
-        <w:tc>
-          <w:tcPr>
-            <w:tcW w:type="dxa" w:w="2160"/>
-          </w:tcPr>
-          <w:p>
-            <w:pPr>
-              <w:jc w:val="right"/>
-              <w:bidi w:val="1"/>
-            </w:pPr>
-            <w:r/>
-            <w:r>
-              <w:rPr>
-                <w:rFonts w:ascii="David" w:hAnsi="David"/>
-                <w:b w:val="0"/>
-                <w:sz w:val="22"/>
-              </w:rPr>
-            </w:r>
-          </w:p>
-        </w:tc>
-      </w:tr>
-      <w:tr>
-        <w:tc>
-          <w:tcPr>
-            <w:tcW w:type="dxa" w:w="2160"/>
-          </w:tcPr>
-          <w:p>
-            <w:pPr>
-              <w:jc w:val="right"/>
-              <w:bidi w:val="1"/>
-            </w:pPr>
-            <w:r/>
-            <w:r>
-              <w:rPr>
-                <w:rFonts w:ascii="David" w:hAnsi="David"/>
-                <w:b w:val="0"/>
-                <w:sz w:val="22"/>
-              </w:rPr>
-              <w:t>53</w:t>
-            </w:r>
-          </w:p>
-        </w:tc>
-        <w:tc>
-          <w:tcPr>
-            <w:tcW w:type="dxa" w:w="2160"/>
-          </w:tcPr>
-          <w:p>
-            <w:pPr>
-              <w:jc w:val="right"/>
-              <w:bidi w:val="1"/>
-            </w:pPr>
-            <w:r/>
-            <w:r>
-              <w:rPr>
-                <w:rFonts w:ascii="David" w:hAnsi="David"/>
-                <w:b/>
-                <w:sz w:val="22"/>
-              </w:rPr>
-              <w:t>יצחק</w:t>
-            </w:r>
-          </w:p>
-        </w:tc>
-        <w:tc>
-          <w:tcPr>
-            <w:tcW w:type="dxa" w:w="2160"/>
-          </w:tcPr>
-          <w:p>
-            <w:pPr>
-              <w:jc w:val="right"/>
-              <w:bidi w:val="1"/>
-            </w:pPr>
-            <w:r/>
-            <w:r>
-              <w:rPr>
-                <w:rFonts w:ascii="David" w:hAnsi="David"/>
-                <w:b w:val="0"/>
-                <w:sz w:val="22"/>
-              </w:rPr>
-              <w:t>חשוב להגיד מילה אחת חשובה: מסע כזה אינו נעשה ביום אחד. וגם לא בשבוע. זה תהליך הדרגתי. כמו שלימדו רבותינו במידות — צעד ועוד צעד, מעלה אחר מעלה.</w:t>
+              <w:t>המצב הראשון — תודעה ריאקטיבית. מצב של "טייס אוטומטי". של תגובה לפי דפוסים שמחווטים בנו.</w:t>
             </w:r>
           </w:p>
         </w:tc>
@@ -4538,7 +4538,7 @@
                 <w:b/>
                 <w:sz w:val="22"/>
               </w:rPr>
-              <w:t>חיים</w:t>
+              <w:t>יצחק</w:t>
             </w:r>
           </w:p>
         </w:tc>
@@ -4558,7 +4558,7 @@
                 <w:b w:val="0"/>
                 <w:sz w:val="22"/>
               </w:rPr>
-              <w:t>יישר כוח על ההדגשה הזאת. אנחנו לא מבקשים מאף אחד לשנות את החיים שלו עכשיו. אנחנו רק מתחילים מסע.</w:t>
+              <w:t>המצב השני — תודעה פרואקטיבית. מצב של בחירה חופשית, של אחריות אישית, של שקט פנימי גם בתוך הסערה.</w:t>
             </w:r>
           </w:p>
         </w:tc>
@@ -4600,6 +4600,249 @@
                 <w:sz w:val="22"/>
               </w:rPr>
               <w:t>55</w:t>
+            </w:r>
+          </w:p>
+        </w:tc>
+        <w:tc>
+          <w:tcPr>
+            <w:tcW w:type="dxa" w:w="2160"/>
+          </w:tcPr>
+          <w:p>
+            <w:pPr>
+              <w:jc w:val="right"/>
+              <w:bidi w:val="1"/>
+            </w:pPr>
+            <w:r/>
+            <w:r>
+              <w:rPr>
+                <w:rFonts w:ascii="David" w:hAnsi="David"/>
+                <w:b/>
+                <w:sz w:val="22"/>
+              </w:rPr>
+              <w:t>חיים</w:t>
+            </w:r>
+          </w:p>
+        </w:tc>
+        <w:tc>
+          <w:tcPr>
+            <w:tcW w:type="dxa" w:w="2160"/>
+          </w:tcPr>
+          <w:p>
+            <w:pPr>
+              <w:jc w:val="right"/>
+              <w:bidi w:val="1"/>
+            </w:pPr>
+            <w:r/>
+            <w:r>
+              <w:rPr>
+                <w:rFonts w:ascii="David" w:hAnsi="David"/>
+                <w:b w:val="0"/>
+                <w:sz w:val="22"/>
+              </w:rPr>
+              <w:t>והמצב השלישי — תודעה קריאטיבית. מצב שבו אני מנהיג ויוצר, ברוח של "צלם אלוקים", את החיים שאני רוצה לחיות.</w:t>
+            </w:r>
+          </w:p>
+        </w:tc>
+        <w:tc>
+          <w:tcPr>
+            <w:tcW w:type="dxa" w:w="2160"/>
+          </w:tcPr>
+          <w:p>
+            <w:pPr>
+              <w:jc w:val="right"/>
+              <w:bidi w:val="1"/>
+            </w:pPr>
+            <w:r/>
+            <w:r>
+              <w:rPr>
+                <w:rFonts w:ascii="David" w:hAnsi="David"/>
+                <w:b w:val="0"/>
+                <w:sz w:val="22"/>
+              </w:rPr>
+            </w:r>
+          </w:p>
+        </w:tc>
+      </w:tr>
+      <w:tr>
+        <w:tc>
+          <w:tcPr>
+            <w:tcW w:type="dxa" w:w="2160"/>
+          </w:tcPr>
+          <w:p>
+            <w:pPr>
+              <w:jc w:val="right"/>
+              <w:bidi w:val="1"/>
+            </w:pPr>
+            <w:r/>
+            <w:r>
+              <w:rPr>
+                <w:rFonts w:ascii="David" w:hAnsi="David"/>
+                <w:b w:val="0"/>
+                <w:sz w:val="22"/>
+              </w:rPr>
+              <w:t>56</w:t>
+            </w:r>
+          </w:p>
+        </w:tc>
+        <w:tc>
+          <w:tcPr>
+            <w:tcW w:type="dxa" w:w="2160"/>
+          </w:tcPr>
+          <w:p>
+            <w:pPr>
+              <w:jc w:val="right"/>
+              <w:bidi w:val="1"/>
+            </w:pPr>
+            <w:r/>
+            <w:r>
+              <w:rPr>
+                <w:rFonts w:ascii="David" w:hAnsi="David"/>
+                <w:b/>
+                <w:sz w:val="22"/>
+              </w:rPr>
+              <w:t>יצחק</w:t>
+            </w:r>
+          </w:p>
+        </w:tc>
+        <w:tc>
+          <w:tcPr>
+            <w:tcW w:type="dxa" w:w="2160"/>
+          </w:tcPr>
+          <w:p>
+            <w:pPr>
+              <w:jc w:val="right"/>
+              <w:bidi w:val="1"/>
+            </w:pPr>
+            <w:r/>
+            <w:r>
+              <w:rPr>
+                <w:rFonts w:ascii="David" w:hAnsi="David"/>
+                <w:b w:val="0"/>
+                <w:sz w:val="22"/>
+              </w:rPr>
+              <w:t>חשוב מאוד להדגיש מילה אחת לפני שנמשיך הלאה: מסע כזה אינו נעשה ביום אחד. וגם לא בשבוע. זה תהליך הדרגתי. כמו שלימדו אותנו רבותינו במידות — צעד ועוד צעד, מעלה אחר מעלה.</w:t>
+            </w:r>
+          </w:p>
+        </w:tc>
+        <w:tc>
+          <w:tcPr>
+            <w:tcW w:type="dxa" w:w="2160"/>
+          </w:tcPr>
+          <w:p>
+            <w:pPr>
+              <w:jc w:val="right"/>
+              <w:bidi w:val="1"/>
+            </w:pPr>
+            <w:r/>
+            <w:r>
+              <w:rPr>
+                <w:rFonts w:ascii="David" w:hAnsi="David"/>
+                <w:b w:val="0"/>
+                <w:sz w:val="22"/>
+              </w:rPr>
+            </w:r>
+          </w:p>
+        </w:tc>
+      </w:tr>
+      <w:tr>
+        <w:tc>
+          <w:tcPr>
+            <w:tcW w:type="dxa" w:w="2160"/>
+          </w:tcPr>
+          <w:p>
+            <w:pPr>
+              <w:jc w:val="right"/>
+              <w:bidi w:val="1"/>
+            </w:pPr>
+            <w:r/>
+            <w:r>
+              <w:rPr>
+                <w:rFonts w:ascii="David" w:hAnsi="David"/>
+                <w:b w:val="0"/>
+                <w:sz w:val="22"/>
+              </w:rPr>
+              <w:t>57</w:t>
+            </w:r>
+          </w:p>
+        </w:tc>
+        <w:tc>
+          <w:tcPr>
+            <w:tcW w:type="dxa" w:w="2160"/>
+          </w:tcPr>
+          <w:p>
+            <w:pPr>
+              <w:jc w:val="right"/>
+              <w:bidi w:val="1"/>
+            </w:pPr>
+            <w:r/>
+            <w:r>
+              <w:rPr>
+                <w:rFonts w:ascii="David" w:hAnsi="David"/>
+                <w:b/>
+                <w:sz w:val="22"/>
+              </w:rPr>
+              <w:t>חיים</w:t>
+            </w:r>
+          </w:p>
+        </w:tc>
+        <w:tc>
+          <w:tcPr>
+            <w:tcW w:type="dxa" w:w="2160"/>
+          </w:tcPr>
+          <w:p>
+            <w:pPr>
+              <w:jc w:val="right"/>
+              <w:bidi w:val="1"/>
+            </w:pPr>
+            <w:r/>
+            <w:r>
+              <w:rPr>
+                <w:rFonts w:ascii="David" w:hAnsi="David"/>
+                <w:b w:val="0"/>
+                <w:sz w:val="22"/>
+              </w:rPr>
+              <w:t>יישר כוח על ההדגשה הזאת, יצחק. אנחנו לא מבקשים מאף אחד לשנות את החיים שלו ביום אחד. אנחנו רק מתחילים מסע.</w:t>
+            </w:r>
+          </w:p>
+        </w:tc>
+        <w:tc>
+          <w:tcPr>
+            <w:tcW w:type="dxa" w:w="2160"/>
+          </w:tcPr>
+          <w:p>
+            <w:pPr>
+              <w:jc w:val="right"/>
+              <w:bidi w:val="1"/>
+            </w:pPr>
+            <w:r/>
+            <w:r>
+              <w:rPr>
+                <w:rFonts w:ascii="David" w:hAnsi="David"/>
+                <w:b w:val="0"/>
+                <w:sz w:val="22"/>
+              </w:rPr>
+            </w:r>
+          </w:p>
+        </w:tc>
+      </w:tr>
+      <w:tr>
+        <w:tc>
+          <w:tcPr>
+            <w:tcW w:type="dxa" w:w="2160"/>
+          </w:tcPr>
+          <w:p>
+            <w:pPr>
+              <w:jc w:val="right"/>
+              <w:bidi w:val="1"/>
+            </w:pPr>
+            <w:r/>
+            <w:r>
+              <w:rPr>
+                <w:rFonts w:ascii="David" w:hAnsi="David"/>
+                <w:b w:val="0"/>
+                <w:sz w:val="22"/>
+              </w:rPr>
+              <w:t>58</w:t>
             </w:r>
           </w:p>
         </w:tc>
@@ -4680,7 +4923,7 @@
                 <w:b w:val="0"/>
                 <w:sz w:val="22"/>
               </w:rPr>
-              <w:t>56</w:t>
+              <w:t>59</w:t>
             </w:r>
           </w:p>
         </w:tc>
@@ -4720,250 +4963,7 @@
                 <w:b w:val="0"/>
                 <w:sz w:val="22"/>
               </w:rPr>
-              <w:t>קחו מחברת. עט. רגע של שקט. ותחשבו: האם יש לכם מצב שבו אתם יוצאים מאיזון באופן קבוע? אותה התפרצות, אותה היעלבות, אותה תחושת תסכול — שחוזרת על עצמה?</w:t>
-            </w:r>
-          </w:p>
-        </w:tc>
-        <w:tc>
-          <w:tcPr>
-            <w:tcW w:type="dxa" w:w="2160"/>
-          </w:tcPr>
-          <w:p>
-            <w:pPr>
-              <w:jc w:val="right"/>
-              <w:bidi w:val="1"/>
-            </w:pPr>
-            <w:r/>
-            <w:r>
-              <w:rPr>
-                <w:rFonts w:ascii="David" w:hAnsi="David"/>
-                <w:b w:val="0"/>
-                <w:sz w:val="22"/>
-              </w:rPr>
-            </w:r>
-          </w:p>
-        </w:tc>
-      </w:tr>
-      <w:tr>
-        <w:tc>
-          <w:tcPr>
-            <w:tcW w:type="dxa" w:w="2160"/>
-          </w:tcPr>
-          <w:p>
-            <w:pPr>
-              <w:jc w:val="right"/>
-              <w:bidi w:val="1"/>
-            </w:pPr>
-            <w:r/>
-            <w:r>
-              <w:rPr>
-                <w:rFonts w:ascii="David" w:hAnsi="David"/>
-                <w:b w:val="0"/>
-                <w:sz w:val="22"/>
-              </w:rPr>
-              <w:t>57</w:t>
-            </w:r>
-          </w:p>
-        </w:tc>
-        <w:tc>
-          <w:tcPr>
-            <w:tcW w:type="dxa" w:w="2160"/>
-          </w:tcPr>
-          <w:p>
-            <w:pPr>
-              <w:jc w:val="right"/>
-              <w:bidi w:val="1"/>
-            </w:pPr>
-            <w:r/>
-            <w:r>
-              <w:rPr>
-                <w:rFonts w:ascii="David" w:hAnsi="David"/>
-                <w:b/>
-                <w:sz w:val="22"/>
-              </w:rPr>
-              <w:t>יצחק</w:t>
-            </w:r>
-          </w:p>
-        </w:tc>
-        <w:tc>
-          <w:tcPr>
-            <w:tcW w:type="dxa" w:w="2160"/>
-          </w:tcPr>
-          <w:p>
-            <w:pPr>
-              <w:jc w:val="right"/>
-              <w:bidi w:val="1"/>
-            </w:pPr>
-            <w:r/>
-            <w:r>
-              <w:rPr>
-                <w:rFonts w:ascii="David" w:hAnsi="David"/>
-                <w:b w:val="0"/>
-                <w:sz w:val="22"/>
-              </w:rPr>
-              <w:t>זה יכול להיות עם אחד הילדים. עם בן או בת הזוג. עם שכן, עם המנהל בעבודה.</w:t>
-            </w:r>
-          </w:p>
-        </w:tc>
-        <w:tc>
-          <w:tcPr>
-            <w:tcW w:type="dxa" w:w="2160"/>
-          </w:tcPr>
-          <w:p>
-            <w:pPr>
-              <w:jc w:val="right"/>
-              <w:bidi w:val="1"/>
-            </w:pPr>
-            <w:r/>
-            <w:r>
-              <w:rPr>
-                <w:rFonts w:ascii="David" w:hAnsi="David"/>
-                <w:b w:val="0"/>
-                <w:sz w:val="22"/>
-              </w:rPr>
-            </w:r>
-          </w:p>
-        </w:tc>
-      </w:tr>
-      <w:tr>
-        <w:tc>
-          <w:tcPr>
-            <w:tcW w:type="dxa" w:w="2160"/>
-          </w:tcPr>
-          <w:p>
-            <w:pPr>
-              <w:jc w:val="right"/>
-              <w:bidi w:val="1"/>
-            </w:pPr>
-            <w:r/>
-            <w:r>
-              <w:rPr>
-                <w:rFonts w:ascii="David" w:hAnsi="David"/>
-                <w:b w:val="0"/>
-                <w:sz w:val="22"/>
-              </w:rPr>
-              <w:t>58</w:t>
-            </w:r>
-          </w:p>
-        </w:tc>
-        <w:tc>
-          <w:tcPr>
-            <w:tcW w:type="dxa" w:w="2160"/>
-          </w:tcPr>
-          <w:p>
-            <w:pPr>
-              <w:jc w:val="right"/>
-              <w:bidi w:val="1"/>
-            </w:pPr>
-            <w:r/>
-            <w:r>
-              <w:rPr>
-                <w:rFonts w:ascii="David" w:hAnsi="David"/>
-                <w:b/>
-                <w:sz w:val="22"/>
-              </w:rPr>
-              <w:t>חיים</w:t>
-            </w:r>
-          </w:p>
-        </w:tc>
-        <w:tc>
-          <w:tcPr>
-            <w:tcW w:type="dxa" w:w="2160"/>
-          </w:tcPr>
-          <w:p>
-            <w:pPr>
-              <w:jc w:val="right"/>
-              <w:bidi w:val="1"/>
-            </w:pPr>
-            <w:r/>
-            <w:r>
-              <w:rPr>
-                <w:rFonts w:ascii="David" w:hAnsi="David"/>
-                <w:b w:val="0"/>
-                <w:sz w:val="22"/>
-              </w:rPr>
-              <w:t>תארו את המצב במשפט אחד או שניים במחברת. אל תנתחו, אל תשפטו את עצמכם. רק תארו.</w:t>
-            </w:r>
-          </w:p>
-        </w:tc>
-        <w:tc>
-          <w:tcPr>
-            <w:tcW w:type="dxa" w:w="2160"/>
-          </w:tcPr>
-          <w:p>
-            <w:pPr>
-              <w:jc w:val="right"/>
-              <w:bidi w:val="1"/>
-            </w:pPr>
-            <w:r/>
-            <w:r>
-              <w:rPr>
-                <w:rFonts w:ascii="David" w:hAnsi="David"/>
-                <w:b w:val="0"/>
-                <w:sz w:val="22"/>
-              </w:rPr>
-            </w:r>
-          </w:p>
-        </w:tc>
-      </w:tr>
-      <w:tr>
-        <w:tc>
-          <w:tcPr>
-            <w:tcW w:type="dxa" w:w="2160"/>
-          </w:tcPr>
-          <w:p>
-            <w:pPr>
-              <w:jc w:val="right"/>
-              <w:bidi w:val="1"/>
-            </w:pPr>
-            <w:r/>
-            <w:r>
-              <w:rPr>
-                <w:rFonts w:ascii="David" w:hAnsi="David"/>
-                <w:b w:val="0"/>
-                <w:sz w:val="22"/>
-              </w:rPr>
-              <w:t>59</w:t>
-            </w:r>
-          </w:p>
-        </w:tc>
-        <w:tc>
-          <w:tcPr>
-            <w:tcW w:type="dxa" w:w="2160"/>
-          </w:tcPr>
-          <w:p>
-            <w:pPr>
-              <w:jc w:val="right"/>
-              <w:bidi w:val="1"/>
-            </w:pPr>
-            <w:r/>
-            <w:r>
-              <w:rPr>
-                <w:rFonts w:ascii="David" w:hAnsi="David"/>
-                <w:b/>
-                <w:sz w:val="22"/>
-              </w:rPr>
-              <w:t>יצחק</w:t>
-            </w:r>
-          </w:p>
-        </w:tc>
-        <w:tc>
-          <w:tcPr>
-            <w:tcW w:type="dxa" w:w="2160"/>
-          </w:tcPr>
-          <w:p>
-            <w:pPr>
-              <w:jc w:val="right"/>
-              <w:bidi w:val="1"/>
-            </w:pPr>
-            <w:r/>
-            <w:r>
-              <w:rPr>
-                <w:rFonts w:ascii="David" w:hAnsi="David"/>
-                <w:b w:val="0"/>
-                <w:sz w:val="22"/>
-              </w:rPr>
-              <w:t>המצב הזה ילווה אותנו בשיחות הקרובות. דרכו נלמד להכיר את "מערכת ההפעלה" של עצמנו.</w:t>
+              <w:t>קחו את המחברת. את העט. רגע של שקט. וחשבו לעצמכם: האם יש לכם מצב שבו אתם יוצאים מאיזון באופן קבוע? אותה התפרצות, אותה היעלבות, אותה תחושת תסכול — שחוזרת על עצמה שוב ושוב?</w:t>
             </w:r>
           </w:p>
         </w:tc>
@@ -5024,7 +5024,7 @@
                 <w:b/>
                 <w:sz w:val="22"/>
               </w:rPr>
-              <w:t>חיים</w:t>
+              <w:t>יצחק</w:t>
             </w:r>
           </w:p>
         </w:tc>
@@ -5044,7 +5044,7 @@
                 <w:b w:val="0"/>
                 <w:sz w:val="22"/>
               </w:rPr>
-              <w:t>ובעז"ה, נלמד גם איך מתחילים לחווט אותה מחדש.</w:t>
+              <w:t>זה יכול להיות עם אחד הילדים. עם בן או בת הזוג. עם שכן. עם המנהל בעבודה.</w:t>
             </w:r>
           </w:p>
         </w:tc>
@@ -5105,7 +5105,7 @@
                 <w:b/>
                 <w:sz w:val="22"/>
               </w:rPr>
-              <w:t>יצחק</w:t>
+              <w:t>חיים</w:t>
             </w:r>
           </w:p>
         </w:tc>
@@ -5125,7 +5125,7 @@
                 <w:b w:val="0"/>
                 <w:sz w:val="22"/>
               </w:rPr>
-              <w:t>בשיחה הבאה נצלול לתוך השאלה — למה זה בכלל קורה? למה התודעה שלנו עובדת ככה?</w:t>
+              <w:t>תארו את המצב במשפט אחד או שניים. רק תיאור. אל תנתחו, אל תשפטו את עצמכם. רק תארו.</w:t>
             </w:r>
           </w:p>
         </w:tc>
@@ -5167,6 +5167,249 @@
                 <w:sz w:val="22"/>
               </w:rPr>
               <w:t>62</w:t>
+            </w:r>
+          </w:p>
+        </w:tc>
+        <w:tc>
+          <w:tcPr>
+            <w:tcW w:type="dxa" w:w="2160"/>
+          </w:tcPr>
+          <w:p>
+            <w:pPr>
+              <w:jc w:val="right"/>
+              <w:bidi w:val="1"/>
+            </w:pPr>
+            <w:r/>
+            <w:r>
+              <w:rPr>
+                <w:rFonts w:ascii="David" w:hAnsi="David"/>
+                <w:b/>
+                <w:sz w:val="22"/>
+              </w:rPr>
+              <w:t>יצחק</w:t>
+            </w:r>
+          </w:p>
+        </w:tc>
+        <w:tc>
+          <w:tcPr>
+            <w:tcW w:type="dxa" w:w="2160"/>
+          </w:tcPr>
+          <w:p>
+            <w:pPr>
+              <w:jc w:val="right"/>
+              <w:bidi w:val="1"/>
+            </w:pPr>
+            <w:r/>
+            <w:r>
+              <w:rPr>
+                <w:rFonts w:ascii="David" w:hAnsi="David"/>
+                <w:b w:val="0"/>
+                <w:sz w:val="22"/>
+              </w:rPr>
+              <w:t>המצב הזה ילווה אותנו לאורך השיחות הקרובות. דרכו נלמד להכיר את "מערכת ההפעלה" של עצמנו.</w:t>
+            </w:r>
+          </w:p>
+        </w:tc>
+        <w:tc>
+          <w:tcPr>
+            <w:tcW w:type="dxa" w:w="2160"/>
+          </w:tcPr>
+          <w:p>
+            <w:pPr>
+              <w:jc w:val="right"/>
+              <w:bidi w:val="1"/>
+            </w:pPr>
+            <w:r/>
+            <w:r>
+              <w:rPr>
+                <w:rFonts w:ascii="David" w:hAnsi="David"/>
+                <w:b w:val="0"/>
+                <w:sz w:val="22"/>
+              </w:rPr>
+            </w:r>
+          </w:p>
+        </w:tc>
+      </w:tr>
+      <w:tr>
+        <w:tc>
+          <w:tcPr>
+            <w:tcW w:type="dxa" w:w="2160"/>
+          </w:tcPr>
+          <w:p>
+            <w:pPr>
+              <w:jc w:val="right"/>
+              <w:bidi w:val="1"/>
+            </w:pPr>
+            <w:r/>
+            <w:r>
+              <w:rPr>
+                <w:rFonts w:ascii="David" w:hAnsi="David"/>
+                <w:b w:val="0"/>
+                <w:sz w:val="22"/>
+              </w:rPr>
+              <w:t>63</w:t>
+            </w:r>
+          </w:p>
+        </w:tc>
+        <w:tc>
+          <w:tcPr>
+            <w:tcW w:type="dxa" w:w="2160"/>
+          </w:tcPr>
+          <w:p>
+            <w:pPr>
+              <w:jc w:val="right"/>
+              <w:bidi w:val="1"/>
+            </w:pPr>
+            <w:r/>
+            <w:r>
+              <w:rPr>
+                <w:rFonts w:ascii="David" w:hAnsi="David"/>
+                <w:b/>
+                <w:sz w:val="22"/>
+              </w:rPr>
+              <w:t>חיים</w:t>
+            </w:r>
+          </w:p>
+        </w:tc>
+        <w:tc>
+          <w:tcPr>
+            <w:tcW w:type="dxa" w:w="2160"/>
+          </w:tcPr>
+          <w:p>
+            <w:pPr>
+              <w:jc w:val="right"/>
+              <w:bidi w:val="1"/>
+            </w:pPr>
+            <w:r/>
+            <w:r>
+              <w:rPr>
+                <w:rFonts w:ascii="David" w:hAnsi="David"/>
+                <w:b w:val="0"/>
+                <w:sz w:val="22"/>
+              </w:rPr>
+              <w:t>ובעז"ה, נלמד גם איך מתחילים, בעדינות ובהדרגה, לחווט אותה מחדש.</w:t>
+            </w:r>
+          </w:p>
+        </w:tc>
+        <w:tc>
+          <w:tcPr>
+            <w:tcW w:type="dxa" w:w="2160"/>
+          </w:tcPr>
+          <w:p>
+            <w:pPr>
+              <w:jc w:val="right"/>
+              <w:bidi w:val="1"/>
+            </w:pPr>
+            <w:r/>
+            <w:r>
+              <w:rPr>
+                <w:rFonts w:ascii="David" w:hAnsi="David"/>
+                <w:b w:val="0"/>
+                <w:sz w:val="22"/>
+              </w:rPr>
+            </w:r>
+          </w:p>
+        </w:tc>
+      </w:tr>
+      <w:tr>
+        <w:tc>
+          <w:tcPr>
+            <w:tcW w:type="dxa" w:w="2160"/>
+          </w:tcPr>
+          <w:p>
+            <w:pPr>
+              <w:jc w:val="right"/>
+              <w:bidi w:val="1"/>
+            </w:pPr>
+            <w:r/>
+            <w:r>
+              <w:rPr>
+                <w:rFonts w:ascii="David" w:hAnsi="David"/>
+                <w:b w:val="0"/>
+                <w:sz w:val="22"/>
+              </w:rPr>
+              <w:t>64</w:t>
+            </w:r>
+          </w:p>
+        </w:tc>
+        <w:tc>
+          <w:tcPr>
+            <w:tcW w:type="dxa" w:w="2160"/>
+          </w:tcPr>
+          <w:p>
+            <w:pPr>
+              <w:jc w:val="right"/>
+              <w:bidi w:val="1"/>
+            </w:pPr>
+            <w:r/>
+            <w:r>
+              <w:rPr>
+                <w:rFonts w:ascii="David" w:hAnsi="David"/>
+                <w:b/>
+                <w:sz w:val="22"/>
+              </w:rPr>
+              <w:t>יצחק</w:t>
+            </w:r>
+          </w:p>
+        </w:tc>
+        <w:tc>
+          <w:tcPr>
+            <w:tcW w:type="dxa" w:w="2160"/>
+          </w:tcPr>
+          <w:p>
+            <w:pPr>
+              <w:jc w:val="right"/>
+              <w:bidi w:val="1"/>
+            </w:pPr>
+            <w:r/>
+            <w:r>
+              <w:rPr>
+                <w:rFonts w:ascii="David" w:hAnsi="David"/>
+                <w:b w:val="0"/>
+                <w:sz w:val="22"/>
+              </w:rPr>
+              <w:t>בשיחה הבאה נצלול אל תוך השאלה — למה זה בכלל קורה? למה התודעה שלנו עובדת ככה?</w:t>
+            </w:r>
+          </w:p>
+        </w:tc>
+        <w:tc>
+          <w:tcPr>
+            <w:tcW w:type="dxa" w:w="2160"/>
+          </w:tcPr>
+          <w:p>
+            <w:pPr>
+              <w:jc w:val="right"/>
+              <w:bidi w:val="1"/>
+            </w:pPr>
+            <w:r/>
+            <w:r>
+              <w:rPr>
+                <w:rFonts w:ascii="David" w:hAnsi="David"/>
+                <w:b w:val="0"/>
+                <w:sz w:val="22"/>
+              </w:rPr>
+            </w:r>
+          </w:p>
+        </w:tc>
+      </w:tr>
+      <w:tr>
+        <w:tc>
+          <w:tcPr>
+            <w:tcW w:type="dxa" w:w="2160"/>
+          </w:tcPr>
+          <w:p>
+            <w:pPr>
+              <w:jc w:val="right"/>
+              <w:bidi w:val="1"/>
+            </w:pPr>
+            <w:r/>
+            <w:r>
+              <w:rPr>
+                <w:rFonts w:ascii="David" w:hAnsi="David"/>
+                <w:b w:val="0"/>
+                <w:sz w:val="22"/>
+              </w:rPr>
+              <w:t>65</w:t>
             </w:r>
           </w:p>
         </w:tc>
@@ -5247,7 +5490,7 @@
                 <w:b w:val="0"/>
                 <w:sz w:val="22"/>
               </w:rPr>
-              <w:t>63</w:t>
+              <w:t>66</w:t>
             </w:r>
           </w:p>
         </w:tc>
@@ -5287,7 +5530,7 @@
                 <w:b w:val="0"/>
                 <w:sz w:val="22"/>
               </w:rPr>
-              <w:t>בשמחה רבה. נשתמע בעז"ה בשיחה הבאה.</w:t>
+              <w:t>בשמחה רבה, חיים. נשתמע בעז"ה בשיחה הבאה.</w:t>
             </w:r>
           </w:p>
         </w:tc>
@@ -5328,7 +5571,7 @@
                 <w:b w:val="0"/>
                 <w:sz w:val="22"/>
               </w:rPr>
-              <w:t>64</w:t>
+              <w:t>67</w:t>
             </w:r>
           </w:p>
         </w:tc>
@@ -5496,7 +5739,7 @@
                 <w:b w:val="0"/>
                 <w:sz w:val="22"/>
               </w:rPr>
-              <w:t>שורה 21</w:t>
+              <w:t>שורה 24</w:t>
             </w:r>
           </w:p>
         </w:tc>
@@ -5516,7 +5759,7 @@
                 <w:b w:val="0"/>
                 <w:sz w:val="22"/>
               </w:rPr>
-              <w:t>"אדם נפעל לפי פעולותיו"</w:t>
+              <w:t>"אחרי הפעולות נמשכים הלבבות"</w:t>
             </w:r>
           </w:p>
         </w:tc>
@@ -5558,7 +5801,7 @@
                 <w:b w:val="0"/>
                 <w:sz w:val="22"/>
               </w:rPr>
-              <w:t>שורה 33</w:t>
+              <w:t>שורה 36</w:t>
             </w:r>
           </w:p>
         </w:tc>
@@ -5620,7 +5863,7 @@
                 <w:b w:val="0"/>
                 <w:sz w:val="22"/>
               </w:rPr>
-              <w:t>שורה 42</w:t>
+              <w:t>שורה 45</w:t>
             </w:r>
           </w:p>
         </w:tc>
@@ -5682,7 +5925,7 @@
                 <w:b w:val="0"/>
                 <w:sz w:val="22"/>
               </w:rPr>
-              <w:t>שורה 46</w:t>
+              <w:t>שורה 49</w:t>
             </w:r>
           </w:p>
         </w:tc>
@@ -5752,7 +5995,7 @@
           <w:b w:val="0"/>
           <w:sz w:val="22"/>
         </w:rPr>
-        <w:t>פתיחה: ~140</w:t>
+        <w:t>פתיחה (כולל סדר יום): ~165</w:t>
       </w:r>
     </w:p>
     <w:p>
@@ -5766,7 +6009,7 @@
           <w:b w:val="0"/>
           <w:sz w:val="22"/>
         </w:rPr>
-        <w:t>פסקת פתיחה קבועה: ~100</w:t>
+        <w:t>פסקת פתיחה קבועה: ~95</w:t>
       </w:r>
     </w:p>
     <w:p>
@@ -5780,7 +6023,7 @@
           <w:b w:val="0"/>
           <w:sz w:val="22"/>
         </w:rPr>
-        <w:t>חלק א' (מערכת הפעלה / ריאקטיבי): ~340</w:t>
+        <w:t>חלק א' (מערכת הפעלה / ריאקטיבי): ~360</w:t>
       </w:r>
     </w:p>
     <w:p>
@@ -5794,7 +6037,7 @@
           <w:b w:val="0"/>
           <w:sz w:val="22"/>
         </w:rPr>
-        <w:t>חלק ב' (פרואקטיבי / קריאטיבי): ~410</w:t>
+        <w:t>חלק ב' (פרואקטיבי / קריאטיבי): ~395</w:t>
       </w:r>
     </w:p>
     <w:p>
@@ -5808,7 +6051,7 @@
           <w:b w:val="0"/>
           <w:sz w:val="22"/>
         </w:rPr>
-        <w:t>סיכום ותרגיל: ~220</w:t>
+        <w:t>סיכום ותרגיל: ~210</w:t>
       </w:r>
     </w:p>
     <w:p>
@@ -5822,7 +6065,7 @@
           <w:b/>
           <w:sz w:val="22"/>
         </w:rPr>
-        <w:t>סה"כ: ~1,210 מילים (≈ 10 דקות בקצב של 120 מילים לדקה)</w:t>
+        <w:t>סה"כ: ~1,225 מילים (≈ 10 דקות בקצב של 120 מילים לדקה)</w:t>
       </w:r>
     </w:p>
     <w:sectPr>

</xml_diff>